<commit_message>
He solucionado los problemas que tenia el flujo basico y he sacado todas las pruebas menos la del flujo completo
</commit_message>
<xml_diff>
--- a/test/AppForSEII2526.UIT/CU_Review/Casos de Prueba Review.docx
+++ b/test/AppForSEII2526.UIT/CU_Review/Casos de Prueba Review.docx
@@ -1673,13 +1673,7 @@
               <w:rPr>
                 <w:lang w:val="es-ES"/>
               </w:rPr>
-              <w:t xml:space="preserve"> - </w:t>
-            </w:r>
-            <w:r>
-              <w:rPr>
-                <w:lang w:val="es-ES"/>
-              </w:rPr>
-              <w:t>No se ha seleccionado ningún coche</w:t>
+              <w:t xml:space="preserve"> - No se ha seleccionado ningún coche</w:t>
             </w:r>
           </w:p>
         </w:tc>
@@ -2182,140 +2176,155 @@
               <w:rPr>
                 <w:lang w:val="es-ES"/>
               </w:rPr>
-              <w:t xml:space="preserve">Modelo: </w:t>
-            </w:r>
+              <w:t>Modelo: Model S</w:t>
+            </w:r>
+          </w:p>
+          <w:p>
+            <w:pPr>
+              <w:rPr>
+                <w:lang w:val="es-ES"/>
+              </w:rPr>
+            </w:pPr>
+            <w:r>
+              <w:rPr>
+                <w:lang w:val="es-ES"/>
+              </w:rPr>
+              <w:t>Fabricante: Tesla</w:t>
+            </w:r>
+          </w:p>
+          <w:p>
+            <w:pPr>
+              <w:rPr>
+                <w:lang w:val="es-ES"/>
+              </w:rPr>
+            </w:pPr>
+            <w:r>
+              <w:rPr>
+                <w:lang w:val="es-ES"/>
+              </w:rPr>
+              <w:t>Combustible: Eléctrico</w:t>
+            </w:r>
+          </w:p>
+          <w:p>
+            <w:pPr>
+              <w:rPr>
+                <w:lang w:val="es-ES"/>
+              </w:rPr>
+            </w:pPr>
+            <w:r>
+              <w:rPr>
+                <w:lang w:val="es-ES"/>
+              </w:rPr>
+              <w:t>Color: Blanco</w:t>
+            </w:r>
+          </w:p>
+          <w:p>
+            <w:pPr>
+              <w:ind w:firstLine="708"/>
+              <w:rPr>
+                <w:lang w:val="es-ES"/>
+              </w:rPr>
+            </w:pPr>
+          </w:p>
+        </w:tc>
+        <w:tc>
+          <w:tcPr>
+            <w:tcW w:w="1930" w:type="dxa"/>
+          </w:tcPr>
+          <w:p>
+            <w:pPr>
+              <w:rPr>
+                <w:lang w:val="es-ES"/>
+              </w:rPr>
+            </w:pPr>
+            <w:r>
+              <w:rPr>
+                <w:lang w:val="es-ES"/>
+              </w:rPr>
+              <w:t>Sin filtro</w:t>
+            </w:r>
+          </w:p>
+        </w:tc>
+        <w:tc>
+          <w:tcPr>
+            <w:tcW w:w="1930" w:type="dxa"/>
+          </w:tcPr>
+          <w:p>
+            <w:pPr>
+              <w:rPr>
+                <w:lang w:val="es-ES"/>
+              </w:rPr>
+            </w:pPr>
+            <w:r>
+              <w:rPr>
+                <w:lang w:val="es-ES"/>
+              </w:rPr>
+              <w:t>Nombre: Israel</w:t>
+            </w:r>
+          </w:p>
+          <w:p>
+            <w:pPr>
+              <w:rPr>
+                <w:lang w:val="es-ES"/>
+              </w:rPr>
+            </w:pPr>
+            <w:r>
+              <w:rPr>
+                <w:lang w:val="es-ES"/>
+              </w:rPr>
+              <w:t>Apellido: Amador</w:t>
+            </w:r>
+          </w:p>
+          <w:p>
+            <w:pPr>
+              <w:rPr>
+                <w:lang w:val="es-ES"/>
+              </w:rPr>
+            </w:pPr>
             <w:proofErr w:type="spellStart"/>
             <w:r>
               <w:rPr>
                 <w:lang w:val="es-ES"/>
               </w:rPr>
-              <w:t>Model</w:t>
+              <w:t>Pais</w:t>
             </w:r>
             <w:proofErr w:type="spellEnd"/>
             <w:r>
               <w:rPr>
                 <w:lang w:val="es-ES"/>
               </w:rPr>
-              <w:t xml:space="preserve"> S</w:t>
-            </w:r>
-          </w:p>
-          <w:p>
-            <w:pPr>
-              <w:rPr>
-                <w:lang w:val="es-ES"/>
-              </w:rPr>
-            </w:pPr>
-            <w:r>
-              <w:rPr>
-                <w:lang w:val="es-ES"/>
-              </w:rPr>
-              <w:t>Fabricante: Tesla</w:t>
-            </w:r>
-          </w:p>
-          <w:p>
-            <w:pPr>
-              <w:rPr>
-                <w:lang w:val="es-ES"/>
-              </w:rPr>
-            </w:pPr>
-            <w:r>
-              <w:rPr>
-                <w:lang w:val="es-ES"/>
-              </w:rPr>
-              <w:t>Combustible: Eléctrico</w:t>
-            </w:r>
-          </w:p>
-          <w:p>
-            <w:pPr>
-              <w:rPr>
-                <w:lang w:val="es-ES"/>
-              </w:rPr>
-            </w:pPr>
-            <w:r>
-              <w:rPr>
-                <w:lang w:val="es-ES"/>
-              </w:rPr>
-              <w:t>Color: Blanco</w:t>
-            </w:r>
-          </w:p>
-          <w:p>
-            <w:pPr>
-              <w:ind w:firstLine="708"/>
-              <w:rPr>
-                <w:lang w:val="es-ES"/>
-              </w:rPr>
-            </w:pPr>
-          </w:p>
-        </w:tc>
-        <w:tc>
-          <w:tcPr>
-            <w:tcW w:w="1930" w:type="dxa"/>
-          </w:tcPr>
-          <w:p>
-            <w:pPr>
-              <w:rPr>
-                <w:lang w:val="es-ES"/>
-              </w:rPr>
-            </w:pPr>
-          </w:p>
-        </w:tc>
-        <w:tc>
-          <w:tcPr>
-            <w:tcW w:w="1930" w:type="dxa"/>
-          </w:tcPr>
-          <w:p>
-            <w:pPr>
-              <w:rPr>
-                <w:lang w:val="es-ES"/>
-              </w:rPr>
-            </w:pPr>
-            <w:r>
-              <w:rPr>
-                <w:lang w:val="es-ES"/>
-              </w:rPr>
-              <w:t>Nombre: Israel</w:t>
-            </w:r>
-          </w:p>
-          <w:p>
-            <w:pPr>
-              <w:rPr>
-                <w:lang w:val="es-ES"/>
-              </w:rPr>
-            </w:pPr>
-            <w:proofErr w:type="spellStart"/>
-            <w:r>
-              <w:rPr>
-                <w:lang w:val="es-ES"/>
-              </w:rPr>
-              <w:t>Pais</w:t>
-            </w:r>
-            <w:proofErr w:type="spellEnd"/>
-            <w:r>
-              <w:rPr>
-                <w:lang w:val="es-ES"/>
-              </w:rPr>
               <w:t xml:space="preserve">: </w:t>
             </w:r>
-            <w:proofErr w:type="spellStart"/>
-            <w:r>
-              <w:rPr>
-                <w:lang w:val="es-ES"/>
-              </w:rPr>
-              <w:t>Spain</w:t>
-            </w:r>
-            <w:proofErr w:type="spellEnd"/>
-          </w:p>
-          <w:p>
-            <w:pPr>
-              <w:rPr>
-                <w:lang w:val="es-ES"/>
-              </w:rPr>
-            </w:pPr>
-            <w:r>
-              <w:rPr>
-                <w:lang w:val="es-ES"/>
-              </w:rPr>
-              <w:t>Tipo de Conductor: Experto</w:t>
+            <w:r>
+              <w:rPr>
+                <w:lang w:val="es-ES"/>
+              </w:rPr>
+              <w:t>España</w:t>
+            </w:r>
+          </w:p>
+          <w:p>
+            <w:pPr>
+              <w:rPr>
+                <w:lang w:val="es-ES"/>
+              </w:rPr>
+            </w:pPr>
+            <w:r>
+              <w:rPr>
+                <w:lang w:val="es-ES"/>
+              </w:rPr>
+              <w:t>Tipo</w:t>
+            </w:r>
+            <w:r>
+              <w:rPr>
+                <w:lang w:val="es-ES"/>
+              </w:rPr>
+              <w:t xml:space="preserve"> </w:t>
+            </w:r>
+            <w:r>
+              <w:rPr>
+                <w:lang w:val="es-ES"/>
+              </w:rPr>
+              <w:t>de Conductor: Experto</w:t>
             </w:r>
           </w:p>
           <w:p>
@@ -2378,7 +2387,21 @@
                 <w:rFonts w:ascii="Arial" w:hAnsi="Arial" w:cs="Arial"/>
                 <w:lang w:val="es-ES"/>
               </w:rPr>
-              <w:t>rá los siguientes datos en el resumen de la compra:</w:t>
+              <w:t xml:space="preserve">rá los siguientes datos en el resumen de la </w:t>
+            </w:r>
+            <w:r>
+              <w:rPr>
+                <w:rFonts w:ascii="Arial" w:hAnsi="Arial" w:cs="Arial"/>
+                <w:lang w:val="es-ES"/>
+              </w:rPr>
+              <w:t>reseña</w:t>
+            </w:r>
+            <w:r>
+              <w:rPr>
+                <w:rFonts w:ascii="Arial" w:hAnsi="Arial" w:cs="Arial"/>
+                <w:lang w:val="es-ES"/>
+              </w:rPr>
+              <w:t>:</w:t>
             </w:r>
           </w:p>
           <w:p>
@@ -2405,29 +2428,7 @@
                 <w:rFonts w:ascii="Arial" w:hAnsi="Arial" w:cs="Arial"/>
                 <w:lang w:val="es-ES"/>
               </w:rPr>
-              <w:t xml:space="preserve"> los coches seleccionados</w:t>
-            </w:r>
-            <w:r>
-              <w:rPr>
-                <w:rFonts w:ascii="Arial" w:hAnsi="Arial" w:cs="Arial"/>
-                <w:lang w:val="es-ES"/>
-              </w:rPr>
-              <w:t>:</w:t>
-            </w:r>
-            <w:r>
-              <w:rPr>
-                <w:rFonts w:ascii="Arial" w:hAnsi="Arial" w:cs="Arial"/>
-                <w:lang w:val="es-ES"/>
-              </w:rPr>
-              <w:t xml:space="preserve"> modelo, fabricante, color, </w:t>
-            </w:r>
-            <w:r>
-              <w:rPr>
-                <w:rFonts w:ascii="Arial" w:hAnsi="Arial" w:cs="Arial"/>
-                <w:lang w:val="es-ES"/>
-              </w:rPr>
-              <w:lastRenderedPageBreak/>
-              <w:t>puntuación y descripción</w:t>
+              <w:t xml:space="preserve"> los coches seleccionados: modelo, fabricante, color, puntuación y descripción</w:t>
             </w:r>
             <w:r>
               <w:rPr>
@@ -2460,28 +2461,15 @@
                 <w:rFonts w:ascii="Arial" w:hAnsi="Arial" w:cs="Arial"/>
                 <w:lang w:val="es-ES"/>
               </w:rPr>
-              <w:t>reseña</w:t>
+              <w:t xml:space="preserve">reseña: nombre, </w:t>
             </w:r>
             <w:r>
               <w:rPr>
                 <w:rFonts w:ascii="Arial" w:hAnsi="Arial" w:cs="Arial"/>
                 <w:lang w:val="es-ES"/>
               </w:rPr>
-              <w:t>:</w:t>
-            </w:r>
-            <w:r>
-              <w:rPr>
-                <w:rFonts w:ascii="Arial" w:hAnsi="Arial" w:cs="Arial"/>
-                <w:lang w:val="es-ES"/>
-              </w:rPr>
-              <w:t xml:space="preserve"> nombre, país, tipo de conductor y fecha en la que se realizó</w:t>
-            </w:r>
-            <w:r>
-              <w:rPr>
-                <w:rFonts w:ascii="Arial" w:hAnsi="Arial" w:cs="Arial"/>
-                <w:lang w:val="es-ES"/>
-              </w:rPr>
-              <w:t xml:space="preserve"> </w:t>
+              <w:lastRenderedPageBreak/>
+              <w:t xml:space="preserve">país, tipo de conductor y fecha en la que se realizó </w:t>
             </w:r>
           </w:p>
         </w:tc>
@@ -2547,134 +2535,124 @@
               <w:rPr>
                 <w:lang w:val="es-ES"/>
               </w:rPr>
-              <w:t xml:space="preserve">Modelo: </w:t>
-            </w:r>
+              <w:t>Modelo: Model S</w:t>
+            </w:r>
+          </w:p>
+          <w:p>
+            <w:pPr>
+              <w:rPr>
+                <w:lang w:val="es-ES"/>
+              </w:rPr>
+            </w:pPr>
+            <w:r>
+              <w:rPr>
+                <w:lang w:val="es-ES"/>
+              </w:rPr>
+              <w:t>Fabricante: Tesla</w:t>
+            </w:r>
+          </w:p>
+          <w:p>
+            <w:pPr>
+              <w:rPr>
+                <w:lang w:val="es-ES"/>
+              </w:rPr>
+            </w:pPr>
+            <w:r>
+              <w:rPr>
+                <w:lang w:val="es-ES"/>
+              </w:rPr>
+              <w:t>Combustible: Eléctrico</w:t>
+            </w:r>
+          </w:p>
+          <w:p>
+            <w:pPr>
+              <w:rPr>
+                <w:lang w:val="es-ES"/>
+              </w:rPr>
+            </w:pPr>
+            <w:r>
+              <w:rPr>
+                <w:lang w:val="es-ES"/>
+              </w:rPr>
+              <w:t>Color: Blanco</w:t>
+            </w:r>
+          </w:p>
+          <w:p>
+            <w:pPr>
+              <w:rPr>
+                <w:lang w:val="es-ES"/>
+              </w:rPr>
+            </w:pPr>
+          </w:p>
+        </w:tc>
+        <w:tc>
+          <w:tcPr>
+            <w:tcW w:w="1930" w:type="dxa"/>
+          </w:tcPr>
+          <w:p>
+            <w:pPr>
+              <w:jc w:val="left"/>
+              <w:rPr>
+                <w:lang w:val="es-ES"/>
+              </w:rPr>
+            </w:pPr>
+            <w:r>
+              <w:rPr>
+                <w:lang w:val="es-ES"/>
+              </w:rPr>
+              <w:t>Tesla/”</w:t>
+            </w:r>
+            <w:r>
+              <w:rPr>
+                <w:lang w:val="es-ES"/>
+              </w:rPr>
+              <w:t>”</w:t>
+            </w:r>
+          </w:p>
+        </w:tc>
+        <w:tc>
+          <w:tcPr>
+            <w:tcW w:w="1930" w:type="dxa"/>
+          </w:tcPr>
+          <w:p>
+            <w:pPr>
+              <w:rPr>
+                <w:lang w:val="es-ES"/>
+              </w:rPr>
+            </w:pPr>
+            <w:r>
+              <w:rPr>
+                <w:lang w:val="es-ES"/>
+              </w:rPr>
+              <w:t>Nombre: Israel</w:t>
+            </w:r>
+          </w:p>
+          <w:p>
+            <w:pPr>
+              <w:rPr>
+                <w:lang w:val="es-ES"/>
+              </w:rPr>
+            </w:pPr>
             <w:proofErr w:type="spellStart"/>
             <w:r>
               <w:rPr>
                 <w:lang w:val="es-ES"/>
               </w:rPr>
-              <w:t>Model</w:t>
+              <w:t>Pais</w:t>
             </w:r>
             <w:proofErr w:type="spellEnd"/>
             <w:r>
               <w:rPr>
                 <w:lang w:val="es-ES"/>
               </w:rPr>
-              <w:t xml:space="preserve"> S</w:t>
-            </w:r>
-          </w:p>
-          <w:p>
-            <w:pPr>
-              <w:rPr>
-                <w:lang w:val="es-ES"/>
-              </w:rPr>
-            </w:pPr>
-            <w:r>
-              <w:rPr>
-                <w:lang w:val="es-ES"/>
-              </w:rPr>
-              <w:t>Fabricante: Tesla</w:t>
-            </w:r>
-          </w:p>
-          <w:p>
-            <w:pPr>
-              <w:rPr>
-                <w:lang w:val="es-ES"/>
-              </w:rPr>
-            </w:pPr>
-            <w:r>
-              <w:rPr>
-                <w:lang w:val="es-ES"/>
-              </w:rPr>
-              <w:t>Combustible: Eléctrico</w:t>
-            </w:r>
-          </w:p>
-          <w:p>
-            <w:pPr>
-              <w:rPr>
-                <w:lang w:val="es-ES"/>
-              </w:rPr>
-            </w:pPr>
-            <w:r>
-              <w:rPr>
-                <w:lang w:val="es-ES"/>
-              </w:rPr>
-              <w:t>Color: Blanco</w:t>
-            </w:r>
-          </w:p>
-          <w:p>
-            <w:pPr>
-              <w:rPr>
-                <w:lang w:val="es-ES"/>
-              </w:rPr>
-            </w:pPr>
-          </w:p>
-        </w:tc>
-        <w:tc>
-          <w:tcPr>
-            <w:tcW w:w="1930" w:type="dxa"/>
-          </w:tcPr>
-          <w:p>
-            <w:pPr>
-              <w:jc w:val="left"/>
-              <w:rPr>
-                <w:lang w:val="es-ES"/>
-              </w:rPr>
-            </w:pPr>
-            <w:r>
-              <w:rPr>
-                <w:lang w:val="es-ES"/>
-              </w:rPr>
-              <w:t>Tesla/””</w:t>
-            </w:r>
-          </w:p>
-        </w:tc>
-        <w:tc>
-          <w:tcPr>
-            <w:tcW w:w="1930" w:type="dxa"/>
-          </w:tcPr>
-          <w:p>
-            <w:pPr>
-              <w:rPr>
-                <w:lang w:val="es-ES"/>
-              </w:rPr>
-            </w:pPr>
-            <w:r>
-              <w:rPr>
-                <w:lang w:val="es-ES"/>
-              </w:rPr>
-              <w:t>Nombre: Israel</w:t>
-            </w:r>
-          </w:p>
-          <w:p>
-            <w:pPr>
-              <w:rPr>
-                <w:lang w:val="es-ES"/>
-              </w:rPr>
-            </w:pPr>
-            <w:proofErr w:type="spellStart"/>
-            <w:r>
-              <w:rPr>
-                <w:lang w:val="es-ES"/>
-              </w:rPr>
-              <w:t>Pais</w:t>
-            </w:r>
-            <w:proofErr w:type="spellEnd"/>
-            <w:r>
-              <w:rPr>
-                <w:lang w:val="es-ES"/>
-              </w:rPr>
               <w:t xml:space="preserve">: </w:t>
             </w:r>
-            <w:proofErr w:type="spellStart"/>
-            <w:r>
-              <w:rPr>
-                <w:lang w:val="es-ES"/>
-              </w:rPr>
-              <w:t>Spain</w:t>
-            </w:r>
-            <w:proofErr w:type="spellEnd"/>
+            <w:r>
+              <w:rPr>
+                <w:lang w:val="es-ES"/>
+              </w:rPr>
+              <w:t>España</w:t>
+            </w:r>
           </w:p>
           <w:p>
             <w:pPr>
@@ -2869,7 +2847,13 @@
               <w:rPr>
                 <w:lang w:val="es-ES"/>
               </w:rPr>
-              <w:t>“”/</w:t>
+              <w:t>“”</w:t>
+            </w:r>
+            <w:r>
+              <w:rPr>
+                <w:lang w:val="es-ES"/>
+              </w:rPr>
+              <w:t>/</w:t>
             </w:r>
             <w:proofErr w:type="gramEnd"/>
             <w:r>
@@ -2915,16 +2899,8 @@
               <w:rPr>
                 <w:lang w:val="es-ES"/>
               </w:rPr>
-              <w:t xml:space="preserve">: </w:t>
-            </w:r>
-            <w:proofErr w:type="spellStart"/>
-            <w:r>
-              <w:rPr>
-                <w:lang w:val="es-ES"/>
-              </w:rPr>
-              <w:t>Spain</w:t>
-            </w:r>
-            <w:proofErr w:type="spellEnd"/>
+              <w:t>: Spain</w:t>
+            </w:r>
           </w:p>
           <w:p>
             <w:pPr>
@@ -3021,7 +2997,13 @@
               <w:rPr>
                 <w:lang w:val="es-ES"/>
               </w:rPr>
-              <w:t xml:space="preserve"> – 3 / No hay coches disponibles</w:t>
+              <w:t xml:space="preserve"> – 3 / </w:t>
+            </w:r>
+            <w:r>
+              <w:rPr>
+                <w:lang w:val="es-ES"/>
+              </w:rPr>
+              <w:t>No hay coches disponibles</w:t>
             </w:r>
           </w:p>
         </w:tc>
@@ -3049,6 +3031,12 @@
                 <w:lang w:val="es-ES"/>
               </w:rPr>
             </w:pPr>
+            <w:r>
+              <w:rPr>
+                <w:lang w:val="es-ES"/>
+              </w:rPr>
+              <w:t>Sin filtro</w:t>
+            </w:r>
           </w:p>
         </w:tc>
         <w:tc>
@@ -3086,16 +3074,8 @@
               <w:rPr>
                 <w:lang w:val="es-ES"/>
               </w:rPr>
-              <w:t xml:space="preserve">: </w:t>
-            </w:r>
-            <w:proofErr w:type="spellStart"/>
-            <w:r>
-              <w:rPr>
-                <w:lang w:val="es-ES"/>
-              </w:rPr>
-              <w:t>Spain</w:t>
-            </w:r>
-            <w:proofErr w:type="spellEnd"/>
+              <w:t>: Spain</w:t>
+            </w:r>
           </w:p>
           <w:p>
             <w:pPr>
@@ -3210,150 +3190,164 @@
               <w:rPr>
                 <w:lang w:val="es-ES"/>
               </w:rPr>
-              <w:t xml:space="preserve">Modelo: </w:t>
-            </w:r>
+              <w:t>Modelo: Model S</w:t>
+            </w:r>
+          </w:p>
+          <w:p>
+            <w:pPr>
+              <w:rPr>
+                <w:lang w:val="es-ES"/>
+              </w:rPr>
+            </w:pPr>
+            <w:r>
+              <w:rPr>
+                <w:lang w:val="es-ES"/>
+              </w:rPr>
+              <w:t>Fabricante: Tesla</w:t>
+            </w:r>
+          </w:p>
+          <w:p>
+            <w:pPr>
+              <w:rPr>
+                <w:lang w:val="es-ES"/>
+              </w:rPr>
+            </w:pPr>
+            <w:r>
+              <w:rPr>
+                <w:lang w:val="es-ES"/>
+              </w:rPr>
+              <w:t>Combustible: Eléctrico</w:t>
+            </w:r>
+          </w:p>
+          <w:p>
+            <w:pPr>
+              <w:rPr>
+                <w:lang w:val="es-ES"/>
+              </w:rPr>
+            </w:pPr>
+            <w:r>
+              <w:rPr>
+                <w:lang w:val="es-ES"/>
+              </w:rPr>
+              <w:t>Color: Blanco</w:t>
+            </w:r>
+          </w:p>
+          <w:p>
+            <w:pPr>
+              <w:rPr>
+                <w:lang w:val="es-ES"/>
+              </w:rPr>
+            </w:pPr>
+          </w:p>
+          <w:p>
+            <w:pPr>
+              <w:rPr>
+                <w:lang w:val="es-ES"/>
+              </w:rPr>
+            </w:pPr>
+            <w:r>
+              <w:rPr>
+                <w:lang w:val="es-ES"/>
+              </w:rPr>
+              <w:t>Modelo: R8</w:t>
+            </w:r>
+          </w:p>
+          <w:p>
+            <w:pPr>
+              <w:rPr>
+                <w:lang w:val="es-ES"/>
+              </w:rPr>
+            </w:pPr>
+            <w:r>
+              <w:rPr>
+                <w:lang w:val="es-ES"/>
+              </w:rPr>
+              <w:t>Fabricante: Audi</w:t>
+            </w:r>
+          </w:p>
+          <w:p>
+            <w:pPr>
+              <w:rPr>
+                <w:lang w:val="es-ES"/>
+              </w:rPr>
+            </w:pPr>
+            <w:r>
+              <w:rPr>
+                <w:lang w:val="es-ES"/>
+              </w:rPr>
+              <w:t>Combustible: Gasolina</w:t>
+            </w:r>
+          </w:p>
+          <w:p>
+            <w:pPr>
+              <w:rPr>
+                <w:lang w:val="es-ES"/>
+              </w:rPr>
+            </w:pPr>
+            <w:r>
+              <w:rPr>
+                <w:lang w:val="es-ES"/>
+              </w:rPr>
+              <w:t>Color: Rojo</w:t>
+            </w:r>
+          </w:p>
+        </w:tc>
+        <w:tc>
+          <w:tcPr>
+            <w:tcW w:w="1930" w:type="dxa"/>
+          </w:tcPr>
+          <w:p>
+            <w:pPr>
+              <w:jc w:val="left"/>
+              <w:rPr>
+                <w:lang w:val="es-ES"/>
+              </w:rPr>
+            </w:pPr>
+          </w:p>
+        </w:tc>
+        <w:tc>
+          <w:tcPr>
+            <w:tcW w:w="1930" w:type="dxa"/>
+          </w:tcPr>
+          <w:p>
+            <w:pPr>
+              <w:rPr>
+                <w:lang w:val="es-ES"/>
+              </w:rPr>
+            </w:pPr>
+            <w:r>
+              <w:rPr>
+                <w:lang w:val="es-ES"/>
+              </w:rPr>
+              <w:t>Nombre: Israel</w:t>
+            </w:r>
+          </w:p>
+          <w:p>
+            <w:pPr>
+              <w:rPr>
+                <w:lang w:val="es-ES"/>
+              </w:rPr>
+            </w:pPr>
             <w:proofErr w:type="spellStart"/>
             <w:r>
               <w:rPr>
                 <w:lang w:val="es-ES"/>
               </w:rPr>
-              <w:t>Model</w:t>
+              <w:t>Pais</w:t>
             </w:r>
             <w:proofErr w:type="spellEnd"/>
             <w:r>
               <w:rPr>
                 <w:lang w:val="es-ES"/>
               </w:rPr>
-              <w:t xml:space="preserve"> S</w:t>
-            </w:r>
-          </w:p>
-          <w:p>
-            <w:pPr>
-              <w:rPr>
-                <w:lang w:val="es-ES"/>
-              </w:rPr>
-            </w:pPr>
-            <w:r>
-              <w:rPr>
-                <w:lang w:val="es-ES"/>
-              </w:rPr>
-              <w:t>Fabricante: Tesla</w:t>
-            </w:r>
-          </w:p>
-          <w:p>
-            <w:pPr>
-              <w:rPr>
-                <w:lang w:val="es-ES"/>
-              </w:rPr>
-            </w:pPr>
-            <w:r>
-              <w:rPr>
-                <w:lang w:val="es-ES"/>
-              </w:rPr>
-              <w:t>Combustible: Eléctrico</w:t>
-            </w:r>
-          </w:p>
-          <w:p>
-            <w:pPr>
-              <w:rPr>
-                <w:lang w:val="es-ES"/>
-              </w:rPr>
-            </w:pPr>
-            <w:r>
-              <w:rPr>
-                <w:lang w:val="es-ES"/>
-              </w:rPr>
-              <w:t>Color: Blanco</w:t>
-            </w:r>
-          </w:p>
-          <w:p>
-            <w:pPr>
-              <w:rPr>
-                <w:lang w:val="es-ES"/>
-              </w:rPr>
-            </w:pPr>
-            <w:r>
-              <w:rPr>
-                <w:lang w:val="es-ES"/>
-              </w:rPr>
-              <w:t>Color: Rojo</w:t>
-            </w:r>
-          </w:p>
-          <w:p>
-            <w:pPr>
-              <w:jc w:val="left"/>
-              <w:rPr>
-                <w:lang w:val="es-ES"/>
-              </w:rPr>
-            </w:pPr>
-          </w:p>
-          <w:p>
-            <w:pPr>
-              <w:jc w:val="left"/>
-              <w:rPr>
-                <w:lang w:val="es-ES"/>
-              </w:rPr>
-            </w:pPr>
-          </w:p>
-        </w:tc>
-        <w:tc>
-          <w:tcPr>
-            <w:tcW w:w="1930" w:type="dxa"/>
-          </w:tcPr>
-          <w:p>
-            <w:pPr>
-              <w:jc w:val="left"/>
-              <w:rPr>
-                <w:lang w:val="es-ES"/>
-              </w:rPr>
-            </w:pPr>
-          </w:p>
-        </w:tc>
-        <w:tc>
-          <w:tcPr>
-            <w:tcW w:w="1930" w:type="dxa"/>
-          </w:tcPr>
-          <w:p>
-            <w:pPr>
-              <w:rPr>
-                <w:lang w:val="es-ES"/>
-              </w:rPr>
-            </w:pPr>
-            <w:r>
-              <w:rPr>
-                <w:lang w:val="es-ES"/>
-              </w:rPr>
-              <w:t>Nombre: Israel</w:t>
-            </w:r>
-          </w:p>
-          <w:p>
-            <w:pPr>
-              <w:rPr>
-                <w:lang w:val="es-ES"/>
-              </w:rPr>
-            </w:pPr>
-            <w:proofErr w:type="spellStart"/>
-            <w:r>
-              <w:rPr>
-                <w:lang w:val="es-ES"/>
-              </w:rPr>
-              <w:t>Pais</w:t>
-            </w:r>
-            <w:proofErr w:type="spellEnd"/>
-            <w:r>
-              <w:rPr>
-                <w:lang w:val="es-ES"/>
-              </w:rPr>
               <w:t xml:space="preserve">: </w:t>
             </w:r>
-            <w:proofErr w:type="spellStart"/>
-            <w:r>
-              <w:rPr>
-                <w:lang w:val="es-ES"/>
-              </w:rPr>
-              <w:t>Spain</w:t>
-            </w:r>
-            <w:proofErr w:type="spellEnd"/>
+            <w:r>
+              <w:rPr>
+                <w:lang w:val="es-ES"/>
+              </w:rPr>
+              <w:t>España</w:t>
+            </w:r>
           </w:p>
           <w:p>
             <w:pPr>
@@ -3423,15 +3417,154 @@
               <w:rPr>
                 <w:lang w:val="es-ES"/>
               </w:rPr>
+              <w:t>UC4_6</w:t>
+            </w:r>
+          </w:p>
+        </w:tc>
+        <w:tc>
+          <w:tcPr>
+            <w:tcW w:w="2208" w:type="dxa"/>
+          </w:tcPr>
+          <w:p>
+            <w:pPr>
+              <w:jc w:val="left"/>
+              <w:rPr>
+                <w:lang w:val="es-ES"/>
+              </w:rPr>
+            </w:pPr>
+            <w:proofErr w:type="spellStart"/>
+            <w:r>
+              <w:rPr>
+                <w:lang w:val="es-ES"/>
+              </w:rPr>
+              <w:t>Esc</w:t>
+            </w:r>
+            <w:proofErr w:type="spellEnd"/>
+            <w:r>
+              <w:rPr>
+                <w:lang w:val="es-ES"/>
+              </w:rPr>
+              <w:t xml:space="preserve"> – 5 / Nombre </w:t>
+            </w:r>
+            <w:proofErr w:type="spellStart"/>
+            <w:r>
+              <w:rPr>
+                <w:lang w:val="es-ES"/>
+              </w:rPr>
+              <w:t>erroneo</w:t>
+            </w:r>
+            <w:proofErr w:type="spellEnd"/>
+          </w:p>
+        </w:tc>
+        <w:tc>
+          <w:tcPr>
+            <w:tcW w:w="2039" w:type="dxa"/>
+          </w:tcPr>
+          <w:p>
+            <w:pPr>
+              <w:rPr>
+                <w:lang w:val="es-ES"/>
+              </w:rPr>
+            </w:pPr>
+            <w:r>
+              <w:rPr>
+                <w:lang w:val="es-ES"/>
+              </w:rPr>
+              <w:t>Modelo: Model S</w:t>
+            </w:r>
+          </w:p>
+          <w:p>
+            <w:pPr>
+              <w:rPr>
+                <w:lang w:val="es-ES"/>
+              </w:rPr>
+            </w:pPr>
+            <w:r>
+              <w:rPr>
+                <w:lang w:val="es-ES"/>
+              </w:rPr>
+              <w:t>Fabricante: Tesla</w:t>
+            </w:r>
+          </w:p>
+          <w:p>
+            <w:pPr>
+              <w:rPr>
+                <w:lang w:val="es-ES"/>
+              </w:rPr>
+            </w:pPr>
+            <w:r>
+              <w:rPr>
+                <w:lang w:val="es-ES"/>
+              </w:rPr>
+              <w:t>Combustible: Eléctrico</w:t>
+            </w:r>
+          </w:p>
+          <w:p>
+            <w:pPr>
+              <w:rPr>
+                <w:lang w:val="es-ES"/>
+              </w:rPr>
+            </w:pPr>
+            <w:r>
+              <w:rPr>
+                <w:lang w:val="es-ES"/>
+              </w:rPr>
+              <w:t>Color: Blanco</w:t>
+            </w:r>
+          </w:p>
+          <w:p>
+            <w:pPr>
+              <w:rPr>
+                <w:lang w:val="es-ES"/>
+              </w:rPr>
+            </w:pPr>
+            <w:r>
+              <w:rPr>
+                <w:lang w:val="es-ES"/>
+              </w:rPr>
+              <w:t>Modelo: R8</w:t>
+            </w:r>
+          </w:p>
+          <w:p>
+            <w:pPr>
+              <w:rPr>
+                <w:lang w:val="es-ES"/>
+              </w:rPr>
+            </w:pPr>
+            <w:r>
+              <w:rPr>
+                <w:lang w:val="es-ES"/>
+              </w:rPr>
+              <w:t>Fabricante: Audi</w:t>
+            </w:r>
+          </w:p>
+          <w:p>
+            <w:pPr>
+              <w:rPr>
+                <w:lang w:val="es-ES"/>
+              </w:rPr>
+            </w:pPr>
+            <w:r>
+              <w:rPr>
+                <w:lang w:val="es-ES"/>
+              </w:rPr>
+              <w:t>Combustible: Gasolina</w:t>
+            </w:r>
+          </w:p>
+          <w:p>
+            <w:pPr>
+              <w:rPr>
+                <w:lang w:val="es-ES"/>
+              </w:rPr>
+            </w:pPr>
+            <w:r>
+              <w:rPr>
+                <w:lang w:val="es-ES"/>
+              </w:rPr>
               <w:lastRenderedPageBreak/>
-              <w:t>UC4_6</w:t>
-            </w:r>
-          </w:p>
-        </w:tc>
-        <w:tc>
-          <w:tcPr>
-            <w:tcW w:w="2208" w:type="dxa"/>
-          </w:tcPr>
+              <w:t>Color: Rojo</w:t>
+            </w:r>
+          </w:p>
           <w:p>
             <w:pPr>
               <w:jc w:val="left"/>
@@ -3439,225 +3572,64 @@
                 <w:lang w:val="es-ES"/>
               </w:rPr>
             </w:pPr>
+          </w:p>
+        </w:tc>
+        <w:tc>
+          <w:tcPr>
+            <w:tcW w:w="1930" w:type="dxa"/>
+          </w:tcPr>
+          <w:p>
+            <w:pPr>
+              <w:jc w:val="left"/>
+              <w:rPr>
+                <w:lang w:val="es-ES"/>
+              </w:rPr>
+            </w:pPr>
+          </w:p>
+        </w:tc>
+        <w:tc>
+          <w:tcPr>
+            <w:tcW w:w="1930" w:type="dxa"/>
+          </w:tcPr>
+          <w:p>
+            <w:pPr>
+              <w:rPr>
+                <w:lang w:val="es-ES"/>
+              </w:rPr>
+            </w:pPr>
+            <w:r>
+              <w:rPr>
+                <w:lang w:val="es-ES"/>
+              </w:rPr>
+              <w:t>Nombre: “”</w:t>
+            </w:r>
+          </w:p>
+          <w:p>
+            <w:pPr>
+              <w:rPr>
+                <w:lang w:val="es-ES"/>
+              </w:rPr>
+            </w:pPr>
             <w:proofErr w:type="spellStart"/>
             <w:r>
               <w:rPr>
                 <w:lang w:val="es-ES"/>
               </w:rPr>
-              <w:t>Esc</w:t>
+              <w:t>Pais</w:t>
             </w:r>
             <w:proofErr w:type="spellEnd"/>
             <w:r>
               <w:rPr>
                 <w:lang w:val="es-ES"/>
               </w:rPr>
-              <w:t xml:space="preserve"> – 5 / Nombre </w:t>
-            </w:r>
-            <w:proofErr w:type="spellStart"/>
-            <w:r>
-              <w:rPr>
-                <w:lang w:val="es-ES"/>
-              </w:rPr>
-              <w:t>erroneo</w:t>
-            </w:r>
-            <w:proofErr w:type="spellEnd"/>
-          </w:p>
-        </w:tc>
-        <w:tc>
-          <w:tcPr>
-            <w:tcW w:w="2039" w:type="dxa"/>
-          </w:tcPr>
-          <w:p>
-            <w:pPr>
-              <w:rPr>
-                <w:lang w:val="es-ES"/>
-              </w:rPr>
-            </w:pPr>
-            <w:r>
-              <w:rPr>
-                <w:lang w:val="es-ES"/>
-              </w:rPr>
-              <w:t xml:space="preserve">Modelo: </w:t>
-            </w:r>
-            <w:proofErr w:type="spellStart"/>
-            <w:r>
-              <w:rPr>
-                <w:lang w:val="es-ES"/>
-              </w:rPr>
-              <w:t>Model</w:t>
-            </w:r>
-            <w:proofErr w:type="spellEnd"/>
-            <w:r>
-              <w:rPr>
-                <w:lang w:val="es-ES"/>
-              </w:rPr>
-              <w:t xml:space="preserve"> S</w:t>
-            </w:r>
-          </w:p>
-          <w:p>
-            <w:pPr>
-              <w:rPr>
-                <w:lang w:val="es-ES"/>
-              </w:rPr>
-            </w:pPr>
-            <w:r>
-              <w:rPr>
-                <w:lang w:val="es-ES"/>
-              </w:rPr>
-              <w:t>Fabricante: Tesla</w:t>
-            </w:r>
-          </w:p>
-          <w:p>
-            <w:pPr>
-              <w:rPr>
-                <w:lang w:val="es-ES"/>
-              </w:rPr>
-            </w:pPr>
-            <w:r>
-              <w:rPr>
-                <w:lang w:val="es-ES"/>
-              </w:rPr>
-              <w:t>Combustible: Eléctrico</w:t>
-            </w:r>
-          </w:p>
-          <w:p>
-            <w:pPr>
-              <w:rPr>
-                <w:lang w:val="es-ES"/>
-              </w:rPr>
-            </w:pPr>
-            <w:r>
-              <w:rPr>
-                <w:lang w:val="es-ES"/>
-              </w:rPr>
-              <w:t>Color: Blanco</w:t>
-            </w:r>
-          </w:p>
-          <w:p>
-            <w:pPr>
-              <w:rPr>
-                <w:lang w:val="es-ES"/>
-              </w:rPr>
-            </w:pPr>
-            <w:r>
-              <w:rPr>
-                <w:lang w:val="es-ES"/>
-              </w:rPr>
-              <w:t>Modelo: R8</w:t>
-            </w:r>
-          </w:p>
-          <w:p>
-            <w:pPr>
-              <w:rPr>
-                <w:lang w:val="es-ES"/>
-              </w:rPr>
-            </w:pPr>
-            <w:r>
-              <w:rPr>
-                <w:lang w:val="es-ES"/>
-              </w:rPr>
-              <w:t>Fabricante: Audi</w:t>
-            </w:r>
-          </w:p>
-          <w:p>
-            <w:pPr>
-              <w:rPr>
-                <w:lang w:val="es-ES"/>
-              </w:rPr>
-            </w:pPr>
-            <w:r>
-              <w:rPr>
-                <w:lang w:val="es-ES"/>
-              </w:rPr>
-              <w:t>Combustible: Gasolina</w:t>
-            </w:r>
-          </w:p>
-          <w:p>
-            <w:pPr>
-              <w:rPr>
-                <w:lang w:val="es-ES"/>
-              </w:rPr>
-            </w:pPr>
-            <w:r>
-              <w:rPr>
-                <w:lang w:val="es-ES"/>
-              </w:rPr>
-              <w:t>Color: Rojo</w:t>
-            </w:r>
-          </w:p>
-          <w:p>
-            <w:pPr>
-              <w:jc w:val="left"/>
-              <w:rPr>
-                <w:lang w:val="es-ES"/>
-              </w:rPr>
-            </w:pPr>
-          </w:p>
-        </w:tc>
-        <w:tc>
-          <w:tcPr>
-            <w:tcW w:w="1930" w:type="dxa"/>
-          </w:tcPr>
-          <w:p>
-            <w:pPr>
-              <w:jc w:val="left"/>
-              <w:rPr>
-                <w:lang w:val="es-ES"/>
-              </w:rPr>
-            </w:pPr>
-          </w:p>
-        </w:tc>
-        <w:tc>
-          <w:tcPr>
-            <w:tcW w:w="1930" w:type="dxa"/>
-          </w:tcPr>
-          <w:p>
-            <w:pPr>
-              <w:rPr>
-                <w:lang w:val="es-ES"/>
-              </w:rPr>
-            </w:pPr>
-            <w:r>
-              <w:rPr>
-                <w:lang w:val="es-ES"/>
-              </w:rPr>
-              <w:t xml:space="preserve">Nombre: </w:t>
-            </w:r>
-            <w:r>
-              <w:rPr>
-                <w:lang w:val="es-ES"/>
-              </w:rPr>
-              <w:t>“”</w:t>
-            </w:r>
-          </w:p>
-          <w:p>
-            <w:pPr>
-              <w:rPr>
-                <w:lang w:val="es-ES"/>
-              </w:rPr>
-            </w:pPr>
-            <w:proofErr w:type="spellStart"/>
-            <w:r>
-              <w:rPr>
-                <w:lang w:val="es-ES"/>
-              </w:rPr>
-              <w:t>Pais</w:t>
-            </w:r>
-            <w:proofErr w:type="spellEnd"/>
-            <w:r>
-              <w:rPr>
-                <w:lang w:val="es-ES"/>
-              </w:rPr>
               <w:t xml:space="preserve">: </w:t>
             </w:r>
-            <w:proofErr w:type="spellStart"/>
-            <w:r>
-              <w:rPr>
-                <w:lang w:val="es-ES"/>
-              </w:rPr>
-              <w:t>Spain</w:t>
-            </w:r>
-            <w:proofErr w:type="spellEnd"/>
+            <w:r>
+              <w:rPr>
+                <w:lang w:val="es-ES"/>
+              </w:rPr>
+              <w:t>España</w:t>
+            </w:r>
           </w:p>
           <w:p>
             <w:pPr>
@@ -3754,25 +3726,7 @@
               <w:rPr>
                 <w:lang w:val="es-ES"/>
               </w:rPr>
-              <w:t xml:space="preserve"> </w:t>
-            </w:r>
-            <w:r>
-              <w:rPr>
-                <w:lang w:val="es-ES"/>
-              </w:rPr>
-              <w:t>–</w:t>
-            </w:r>
-            <w:r>
-              <w:rPr>
-                <w:lang w:val="es-ES"/>
-              </w:rPr>
-              <w:t xml:space="preserve"> 5</w:t>
-            </w:r>
-            <w:r>
-              <w:rPr>
-                <w:lang w:val="es-ES"/>
-              </w:rPr>
-              <w:t xml:space="preserve"> / País </w:t>
+              <w:t xml:space="preserve"> – 5 / País </w:t>
             </w:r>
             <w:proofErr w:type="spellStart"/>
             <w:r>
@@ -3798,178 +3752,158 @@
               <w:rPr>
                 <w:lang w:val="es-ES"/>
               </w:rPr>
-              <w:t xml:space="preserve">Modelo: </w:t>
-            </w:r>
+              <w:t>Modelo: Model S</w:t>
+            </w:r>
+          </w:p>
+          <w:p>
+            <w:pPr>
+              <w:rPr>
+                <w:lang w:val="es-ES"/>
+              </w:rPr>
+            </w:pPr>
+            <w:r>
+              <w:rPr>
+                <w:lang w:val="es-ES"/>
+              </w:rPr>
+              <w:t>Fabricante: Tesla</w:t>
+            </w:r>
+          </w:p>
+          <w:p>
+            <w:pPr>
+              <w:rPr>
+                <w:lang w:val="es-ES"/>
+              </w:rPr>
+            </w:pPr>
+            <w:r>
+              <w:rPr>
+                <w:lang w:val="es-ES"/>
+              </w:rPr>
+              <w:t>Combustible: Eléctrico</w:t>
+            </w:r>
+          </w:p>
+          <w:p>
+            <w:pPr>
+              <w:rPr>
+                <w:lang w:val="es-ES"/>
+              </w:rPr>
+            </w:pPr>
+            <w:r>
+              <w:rPr>
+                <w:lang w:val="es-ES"/>
+              </w:rPr>
+              <w:t>Color: Blanco</w:t>
+            </w:r>
+          </w:p>
+          <w:p>
+            <w:pPr>
+              <w:rPr>
+                <w:lang w:val="es-ES"/>
+              </w:rPr>
+            </w:pPr>
+            <w:r>
+              <w:rPr>
+                <w:lang w:val="es-ES"/>
+              </w:rPr>
+              <w:t>Modelo: R8</w:t>
+            </w:r>
+          </w:p>
+          <w:p>
+            <w:pPr>
+              <w:rPr>
+                <w:lang w:val="es-ES"/>
+              </w:rPr>
+            </w:pPr>
+            <w:r>
+              <w:rPr>
+                <w:lang w:val="es-ES"/>
+              </w:rPr>
+              <w:t>Fabricante: Audi</w:t>
+            </w:r>
+          </w:p>
+          <w:p>
+            <w:pPr>
+              <w:rPr>
+                <w:lang w:val="es-ES"/>
+              </w:rPr>
+            </w:pPr>
+            <w:r>
+              <w:rPr>
+                <w:lang w:val="es-ES"/>
+              </w:rPr>
+              <w:t>Combustible: Gasolina</w:t>
+            </w:r>
+          </w:p>
+          <w:p>
+            <w:pPr>
+              <w:rPr>
+                <w:lang w:val="es-ES"/>
+              </w:rPr>
+            </w:pPr>
+            <w:r>
+              <w:rPr>
+                <w:lang w:val="es-ES"/>
+              </w:rPr>
+              <w:t>Color: Rojo</w:t>
+            </w:r>
+          </w:p>
+          <w:p>
+            <w:pPr>
+              <w:jc w:val="left"/>
+              <w:rPr>
+                <w:lang w:val="es-ES"/>
+              </w:rPr>
+            </w:pPr>
+          </w:p>
+        </w:tc>
+        <w:tc>
+          <w:tcPr>
+            <w:tcW w:w="1930" w:type="dxa"/>
+          </w:tcPr>
+          <w:p>
+            <w:pPr>
+              <w:jc w:val="left"/>
+              <w:rPr>
+                <w:lang w:val="es-ES"/>
+              </w:rPr>
+            </w:pPr>
+          </w:p>
+        </w:tc>
+        <w:tc>
+          <w:tcPr>
+            <w:tcW w:w="1930" w:type="dxa"/>
+          </w:tcPr>
+          <w:p>
+            <w:pPr>
+              <w:rPr>
+                <w:lang w:val="es-ES"/>
+              </w:rPr>
+            </w:pPr>
+            <w:r>
+              <w:rPr>
+                <w:lang w:val="es-ES"/>
+              </w:rPr>
+              <w:t>Nombre: Israel</w:t>
+            </w:r>
+          </w:p>
+          <w:p>
+            <w:pPr>
+              <w:rPr>
+                <w:lang w:val="es-ES"/>
+              </w:rPr>
+            </w:pPr>
             <w:proofErr w:type="spellStart"/>
             <w:r>
               <w:rPr>
                 <w:lang w:val="es-ES"/>
               </w:rPr>
-              <w:t>Model</w:t>
+              <w:t>Pais</w:t>
             </w:r>
             <w:proofErr w:type="spellEnd"/>
             <w:r>
               <w:rPr>
                 <w:lang w:val="es-ES"/>
               </w:rPr>
-              <w:t xml:space="preserve"> S</w:t>
-            </w:r>
-          </w:p>
-          <w:p>
-            <w:pPr>
-              <w:rPr>
-                <w:lang w:val="es-ES"/>
-              </w:rPr>
-            </w:pPr>
-            <w:r>
-              <w:rPr>
-                <w:lang w:val="es-ES"/>
-              </w:rPr>
-              <w:t>Fabricante: Tesla</w:t>
-            </w:r>
-          </w:p>
-          <w:p>
-            <w:pPr>
-              <w:rPr>
-                <w:lang w:val="es-ES"/>
-              </w:rPr>
-            </w:pPr>
-            <w:r>
-              <w:rPr>
-                <w:lang w:val="es-ES"/>
-              </w:rPr>
-              <w:t>Combustible: Eléctrico</w:t>
-            </w:r>
-          </w:p>
-          <w:p>
-            <w:pPr>
-              <w:rPr>
-                <w:lang w:val="es-ES"/>
-              </w:rPr>
-            </w:pPr>
-            <w:r>
-              <w:rPr>
-                <w:lang w:val="es-ES"/>
-              </w:rPr>
-              <w:t>Color: Blanco</w:t>
-            </w:r>
-          </w:p>
-          <w:p>
-            <w:pPr>
-              <w:rPr>
-                <w:lang w:val="es-ES"/>
-              </w:rPr>
-            </w:pPr>
-            <w:r>
-              <w:rPr>
-                <w:lang w:val="es-ES"/>
-              </w:rPr>
-              <w:t>Modelo: R8</w:t>
-            </w:r>
-          </w:p>
-          <w:p>
-            <w:pPr>
-              <w:rPr>
-                <w:lang w:val="es-ES"/>
-              </w:rPr>
-            </w:pPr>
-            <w:r>
-              <w:rPr>
-                <w:lang w:val="es-ES"/>
-              </w:rPr>
-              <w:t>Fabricante: Audi</w:t>
-            </w:r>
-          </w:p>
-          <w:p>
-            <w:pPr>
-              <w:rPr>
-                <w:lang w:val="es-ES"/>
-              </w:rPr>
-            </w:pPr>
-            <w:r>
-              <w:rPr>
-                <w:lang w:val="es-ES"/>
-              </w:rPr>
-              <w:t>Combustible: Gasolina</w:t>
-            </w:r>
-          </w:p>
-          <w:p>
-            <w:pPr>
-              <w:rPr>
-                <w:lang w:val="es-ES"/>
-              </w:rPr>
-            </w:pPr>
-            <w:r>
-              <w:rPr>
-                <w:lang w:val="es-ES"/>
-              </w:rPr>
-              <w:t>Color: Rojo</w:t>
-            </w:r>
-          </w:p>
-          <w:p>
-            <w:pPr>
-              <w:jc w:val="left"/>
-              <w:rPr>
-                <w:lang w:val="es-ES"/>
-              </w:rPr>
-            </w:pPr>
-          </w:p>
-        </w:tc>
-        <w:tc>
-          <w:tcPr>
-            <w:tcW w:w="1930" w:type="dxa"/>
-          </w:tcPr>
-          <w:p>
-            <w:pPr>
-              <w:jc w:val="left"/>
-              <w:rPr>
-                <w:lang w:val="es-ES"/>
-              </w:rPr>
-            </w:pPr>
-          </w:p>
-        </w:tc>
-        <w:tc>
-          <w:tcPr>
-            <w:tcW w:w="1930" w:type="dxa"/>
-          </w:tcPr>
-          <w:p>
-            <w:pPr>
-              <w:rPr>
-                <w:lang w:val="es-ES"/>
-              </w:rPr>
-            </w:pPr>
-            <w:r>
-              <w:rPr>
-                <w:lang w:val="es-ES"/>
-              </w:rPr>
-              <w:t>Nombre: Israel</w:t>
-            </w:r>
-          </w:p>
-          <w:p>
-            <w:pPr>
-              <w:rPr>
-                <w:lang w:val="es-ES"/>
-              </w:rPr>
-            </w:pPr>
-            <w:proofErr w:type="spellStart"/>
-            <w:r>
-              <w:rPr>
-                <w:lang w:val="es-ES"/>
-              </w:rPr>
-              <w:t>Pais</w:t>
-            </w:r>
-            <w:proofErr w:type="spellEnd"/>
-            <w:r>
-              <w:rPr>
-                <w:lang w:val="es-ES"/>
-              </w:rPr>
-              <w:t xml:space="preserve">: </w:t>
-            </w:r>
-            <w:r>
-              <w:rPr>
-                <w:lang w:val="es-ES"/>
-              </w:rPr>
-              <w:t>“”</w:t>
+              <w:t>: “”</w:t>
             </w:r>
           </w:p>
           <w:p>
@@ -4067,44 +4001,20 @@
               <w:rPr>
                 <w:lang w:val="es-ES"/>
               </w:rPr>
-              <w:t xml:space="preserve"> </w:t>
-            </w:r>
-            <w:r>
-              <w:rPr>
-                <w:lang w:val="es-ES"/>
-              </w:rPr>
-              <w:t>–</w:t>
-            </w:r>
-            <w:r>
-              <w:rPr>
-                <w:lang w:val="es-ES"/>
-              </w:rPr>
-              <w:t xml:space="preserve"> 5</w:t>
-            </w:r>
-            <w:r>
-              <w:rPr>
-                <w:lang w:val="es-ES"/>
-              </w:rPr>
-              <w:t xml:space="preserve"> / </w:t>
-            </w:r>
-            <w:r>
-              <w:rPr>
-                <w:lang w:val="es-ES"/>
-              </w:rPr>
-              <w:t>Tipo de conductor</w:t>
-            </w:r>
-            <w:r>
-              <w:rPr>
-                <w:lang w:val="es-ES"/>
-              </w:rPr>
-              <w:t xml:space="preserve"> </w:t>
+              <w:t xml:space="preserve"> – 5 / Tipo de conductor </w:t>
+            </w:r>
+            <w:r>
+              <w:rPr>
+                <w:lang w:val="es-ES"/>
+              </w:rPr>
+              <w:t xml:space="preserve">obligatorio </w:t>
             </w:r>
             <w:proofErr w:type="spellStart"/>
             <w:r>
               <w:rPr>
                 <w:lang w:val="es-ES"/>
               </w:rPr>
-              <w:t>erroneo</w:t>
+              <w:t>vacio</w:t>
             </w:r>
             <w:proofErr w:type="spellEnd"/>
           </w:p>
@@ -4123,199 +4033,177 @@
               <w:rPr>
                 <w:lang w:val="es-ES"/>
               </w:rPr>
-              <w:t xml:space="preserve">Modelo: </w:t>
-            </w:r>
+              <w:t>Modelo: Model S</w:t>
+            </w:r>
+          </w:p>
+          <w:p>
+            <w:pPr>
+              <w:rPr>
+                <w:lang w:val="es-ES"/>
+              </w:rPr>
+            </w:pPr>
+            <w:r>
+              <w:rPr>
+                <w:lang w:val="es-ES"/>
+              </w:rPr>
+              <w:t>Fabricante: Tesla</w:t>
+            </w:r>
+          </w:p>
+          <w:p>
+            <w:pPr>
+              <w:rPr>
+                <w:lang w:val="es-ES"/>
+              </w:rPr>
+            </w:pPr>
+            <w:r>
+              <w:rPr>
+                <w:lang w:val="es-ES"/>
+              </w:rPr>
+              <w:t>Combustible: Eléctrico</w:t>
+            </w:r>
+          </w:p>
+          <w:p>
+            <w:pPr>
+              <w:rPr>
+                <w:lang w:val="es-ES"/>
+              </w:rPr>
+            </w:pPr>
+            <w:r>
+              <w:rPr>
+                <w:lang w:val="es-ES"/>
+              </w:rPr>
+              <w:t>Color: Blanco</w:t>
+            </w:r>
+          </w:p>
+          <w:p>
+            <w:pPr>
+              <w:rPr>
+                <w:lang w:val="es-ES"/>
+              </w:rPr>
+            </w:pPr>
+            <w:r>
+              <w:rPr>
+                <w:lang w:val="es-ES"/>
+              </w:rPr>
+              <w:t>Modelo: R8</w:t>
+            </w:r>
+          </w:p>
+          <w:p>
+            <w:pPr>
+              <w:rPr>
+                <w:lang w:val="es-ES"/>
+              </w:rPr>
+            </w:pPr>
+            <w:r>
+              <w:rPr>
+                <w:lang w:val="es-ES"/>
+              </w:rPr>
+              <w:t>Fabricante: Audi</w:t>
+            </w:r>
+          </w:p>
+          <w:p>
+            <w:pPr>
+              <w:rPr>
+                <w:lang w:val="es-ES"/>
+              </w:rPr>
+            </w:pPr>
+            <w:r>
+              <w:rPr>
+                <w:lang w:val="es-ES"/>
+              </w:rPr>
+              <w:t>Combustible: Gasolina</w:t>
+            </w:r>
+          </w:p>
+          <w:p>
+            <w:pPr>
+              <w:rPr>
+                <w:lang w:val="es-ES"/>
+              </w:rPr>
+            </w:pPr>
+            <w:r>
+              <w:rPr>
+                <w:lang w:val="es-ES"/>
+              </w:rPr>
+              <w:t>Color: Rojo</w:t>
+            </w:r>
+          </w:p>
+          <w:p>
+            <w:pPr>
+              <w:jc w:val="left"/>
+              <w:rPr>
+                <w:lang w:val="es-ES"/>
+              </w:rPr>
+            </w:pPr>
+          </w:p>
+        </w:tc>
+        <w:tc>
+          <w:tcPr>
+            <w:tcW w:w="1930" w:type="dxa"/>
+          </w:tcPr>
+          <w:p>
+            <w:pPr>
+              <w:jc w:val="left"/>
+              <w:rPr>
+                <w:lang w:val="es-ES"/>
+              </w:rPr>
+            </w:pPr>
+          </w:p>
+        </w:tc>
+        <w:tc>
+          <w:tcPr>
+            <w:tcW w:w="1930" w:type="dxa"/>
+          </w:tcPr>
+          <w:p>
+            <w:pPr>
+              <w:rPr>
+                <w:lang w:val="es-ES"/>
+              </w:rPr>
+            </w:pPr>
+            <w:r>
+              <w:rPr>
+                <w:lang w:val="es-ES"/>
+              </w:rPr>
+              <w:t>Nombre: Israel</w:t>
+            </w:r>
+          </w:p>
+          <w:p>
+            <w:pPr>
+              <w:rPr>
+                <w:lang w:val="es-ES"/>
+              </w:rPr>
+            </w:pPr>
             <w:proofErr w:type="spellStart"/>
             <w:r>
               <w:rPr>
                 <w:lang w:val="es-ES"/>
               </w:rPr>
-              <w:t>Model</w:t>
+              <w:t>Pais</w:t>
             </w:r>
             <w:proofErr w:type="spellEnd"/>
             <w:r>
               <w:rPr>
                 <w:lang w:val="es-ES"/>
               </w:rPr>
-              <w:t xml:space="preserve"> S</w:t>
-            </w:r>
-          </w:p>
-          <w:p>
-            <w:pPr>
-              <w:rPr>
-                <w:lang w:val="es-ES"/>
-              </w:rPr>
-            </w:pPr>
-            <w:r>
-              <w:rPr>
-                <w:lang w:val="es-ES"/>
-              </w:rPr>
-              <w:t>Fabricante: Tesla</w:t>
-            </w:r>
-          </w:p>
-          <w:p>
-            <w:pPr>
-              <w:rPr>
-                <w:lang w:val="es-ES"/>
-              </w:rPr>
-            </w:pPr>
-            <w:r>
-              <w:rPr>
-                <w:lang w:val="es-ES"/>
-              </w:rPr>
-              <w:t>Combustible: Eléctrico</w:t>
-            </w:r>
-          </w:p>
-          <w:p>
-            <w:pPr>
-              <w:rPr>
-                <w:lang w:val="es-ES"/>
-              </w:rPr>
-            </w:pPr>
-            <w:r>
-              <w:rPr>
-                <w:lang w:val="es-ES"/>
-              </w:rPr>
-              <w:t>Color: Blanco</w:t>
-            </w:r>
-          </w:p>
-          <w:p>
-            <w:pPr>
-              <w:rPr>
-                <w:lang w:val="es-ES"/>
-              </w:rPr>
-            </w:pPr>
-            <w:r>
-              <w:rPr>
-                <w:lang w:val="es-ES"/>
-              </w:rPr>
-              <w:t>Modelo: R8</w:t>
-            </w:r>
-          </w:p>
-          <w:p>
-            <w:pPr>
-              <w:rPr>
-                <w:lang w:val="es-ES"/>
-              </w:rPr>
-            </w:pPr>
-            <w:r>
-              <w:rPr>
-                <w:lang w:val="es-ES"/>
-              </w:rPr>
-              <w:t>Fabricante: Audi</w:t>
-            </w:r>
-          </w:p>
-          <w:p>
-            <w:pPr>
-              <w:rPr>
-                <w:lang w:val="es-ES"/>
-              </w:rPr>
-            </w:pPr>
-            <w:r>
-              <w:rPr>
-                <w:lang w:val="es-ES"/>
-              </w:rPr>
-              <w:t>Combustible: Gasolina</w:t>
-            </w:r>
-          </w:p>
-          <w:p>
-            <w:pPr>
-              <w:rPr>
-                <w:lang w:val="es-ES"/>
-              </w:rPr>
-            </w:pPr>
-            <w:r>
-              <w:rPr>
-                <w:lang w:val="es-ES"/>
-              </w:rPr>
-              <w:t>Color: Rojo</w:t>
-            </w:r>
-          </w:p>
-          <w:p>
-            <w:pPr>
-              <w:jc w:val="left"/>
-              <w:rPr>
-                <w:lang w:val="es-ES"/>
-              </w:rPr>
-            </w:pPr>
-          </w:p>
-        </w:tc>
-        <w:tc>
-          <w:tcPr>
-            <w:tcW w:w="1930" w:type="dxa"/>
-          </w:tcPr>
-          <w:p>
-            <w:pPr>
-              <w:jc w:val="left"/>
-              <w:rPr>
-                <w:lang w:val="es-ES"/>
-              </w:rPr>
-            </w:pPr>
-          </w:p>
-        </w:tc>
-        <w:tc>
-          <w:tcPr>
-            <w:tcW w:w="1930" w:type="dxa"/>
-          </w:tcPr>
-          <w:p>
-            <w:pPr>
-              <w:rPr>
-                <w:lang w:val="es-ES"/>
-              </w:rPr>
-            </w:pPr>
-            <w:r>
-              <w:rPr>
-                <w:lang w:val="es-ES"/>
-              </w:rPr>
-              <w:t>Nombre: Israel</w:t>
-            </w:r>
-          </w:p>
-          <w:p>
-            <w:pPr>
-              <w:rPr>
-                <w:lang w:val="es-ES"/>
-              </w:rPr>
-            </w:pPr>
-            <w:proofErr w:type="spellStart"/>
-            <w:r>
-              <w:rPr>
-                <w:lang w:val="es-ES"/>
-              </w:rPr>
-              <w:t>Pais</w:t>
-            </w:r>
-            <w:proofErr w:type="spellEnd"/>
-            <w:r>
-              <w:rPr>
-                <w:lang w:val="es-ES"/>
-              </w:rPr>
               <w:t xml:space="preserve">: </w:t>
             </w:r>
-            <w:proofErr w:type="spellStart"/>
-            <w:r>
-              <w:rPr>
-                <w:lang w:val="es-ES"/>
-              </w:rPr>
-              <w:t>Spain</w:t>
-            </w:r>
-            <w:proofErr w:type="spellEnd"/>
-          </w:p>
-          <w:p>
-            <w:pPr>
-              <w:rPr>
-                <w:lang w:val="es-ES"/>
-              </w:rPr>
-            </w:pPr>
-            <w:r>
-              <w:rPr>
-                <w:lang w:val="es-ES"/>
-              </w:rPr>
-              <w:t xml:space="preserve">Tipo de Conductor: </w:t>
-            </w:r>
-            <w:r>
-              <w:rPr>
-                <w:lang w:val="es-ES"/>
-              </w:rPr>
-              <w:t>“”</w:t>
+            <w:r>
+              <w:rPr>
+                <w:lang w:val="es-ES"/>
+              </w:rPr>
+              <w:t>España</w:t>
+            </w:r>
+          </w:p>
+          <w:p>
+            <w:pPr>
+              <w:rPr>
+                <w:lang w:val="es-ES"/>
+              </w:rPr>
+            </w:pPr>
+            <w:r>
+              <w:rPr>
+                <w:lang w:val="es-ES"/>
+              </w:rPr>
+              <w:t>Tipo de Conductor: “”</w:t>
             </w:r>
           </w:p>
           <w:p>
@@ -4400,25 +4288,7 @@
               <w:rPr>
                 <w:lang w:val="es-ES"/>
               </w:rPr>
-              <w:t xml:space="preserve"> </w:t>
-            </w:r>
-            <w:r>
-              <w:rPr>
-                <w:lang w:val="es-ES"/>
-              </w:rPr>
-              <w:t>–</w:t>
-            </w:r>
-            <w:r>
-              <w:rPr>
-                <w:lang w:val="es-ES"/>
-              </w:rPr>
-              <w:t xml:space="preserve"> 5</w:t>
-            </w:r>
-            <w:r>
-              <w:rPr>
-                <w:lang w:val="es-ES"/>
-              </w:rPr>
-              <w:t xml:space="preserve"> / Rating </w:t>
+              <w:t xml:space="preserve"> – 5 / Rating </w:t>
             </w:r>
             <w:proofErr w:type="spellStart"/>
             <w:r>
@@ -4444,113 +4314,177 @@
               <w:rPr>
                 <w:lang w:val="es-ES"/>
               </w:rPr>
-              <w:t xml:space="preserve">Modelo: </w:t>
-            </w:r>
+              <w:t>Modelo: Model S</w:t>
+            </w:r>
+          </w:p>
+          <w:p>
+            <w:pPr>
+              <w:rPr>
+                <w:lang w:val="es-ES"/>
+              </w:rPr>
+            </w:pPr>
+            <w:r>
+              <w:rPr>
+                <w:lang w:val="es-ES"/>
+              </w:rPr>
+              <w:t>Fabricante: Tesla</w:t>
+            </w:r>
+          </w:p>
+          <w:p>
+            <w:pPr>
+              <w:rPr>
+                <w:lang w:val="es-ES"/>
+              </w:rPr>
+            </w:pPr>
+            <w:r>
+              <w:rPr>
+                <w:lang w:val="es-ES"/>
+              </w:rPr>
+              <w:t>Combustible: Eléctrico</w:t>
+            </w:r>
+          </w:p>
+          <w:p>
+            <w:pPr>
+              <w:rPr>
+                <w:lang w:val="es-ES"/>
+              </w:rPr>
+            </w:pPr>
+            <w:r>
+              <w:rPr>
+                <w:lang w:val="es-ES"/>
+              </w:rPr>
+              <w:t>Color: Blanco</w:t>
+            </w:r>
+          </w:p>
+          <w:p>
+            <w:pPr>
+              <w:rPr>
+                <w:lang w:val="es-ES"/>
+              </w:rPr>
+            </w:pPr>
+            <w:r>
+              <w:rPr>
+                <w:lang w:val="es-ES"/>
+              </w:rPr>
+              <w:t>Modelo: R8</w:t>
+            </w:r>
+          </w:p>
+          <w:p>
+            <w:pPr>
+              <w:rPr>
+                <w:lang w:val="es-ES"/>
+              </w:rPr>
+            </w:pPr>
+            <w:r>
+              <w:rPr>
+                <w:lang w:val="es-ES"/>
+              </w:rPr>
+              <w:t>Fabricante: Audi</w:t>
+            </w:r>
+          </w:p>
+          <w:p>
+            <w:pPr>
+              <w:rPr>
+                <w:lang w:val="es-ES"/>
+              </w:rPr>
+            </w:pPr>
+            <w:r>
+              <w:rPr>
+                <w:lang w:val="es-ES"/>
+              </w:rPr>
+              <w:t>Combustible: Gasolina</w:t>
+            </w:r>
+          </w:p>
+          <w:p>
+            <w:pPr>
+              <w:rPr>
+                <w:lang w:val="es-ES"/>
+              </w:rPr>
+            </w:pPr>
+            <w:r>
+              <w:rPr>
+                <w:lang w:val="es-ES"/>
+              </w:rPr>
+              <w:t>Color: Rojo</w:t>
+            </w:r>
+          </w:p>
+          <w:p>
+            <w:pPr>
+              <w:jc w:val="left"/>
+              <w:rPr>
+                <w:lang w:val="es-ES"/>
+              </w:rPr>
+            </w:pPr>
+          </w:p>
+        </w:tc>
+        <w:tc>
+          <w:tcPr>
+            <w:tcW w:w="1930" w:type="dxa"/>
+          </w:tcPr>
+          <w:p>
+            <w:pPr>
+              <w:jc w:val="left"/>
+              <w:rPr>
+                <w:lang w:val="es-ES"/>
+              </w:rPr>
+            </w:pPr>
+          </w:p>
+        </w:tc>
+        <w:tc>
+          <w:tcPr>
+            <w:tcW w:w="1930" w:type="dxa"/>
+          </w:tcPr>
+          <w:p>
+            <w:pPr>
+              <w:rPr>
+                <w:lang w:val="es-ES"/>
+              </w:rPr>
+            </w:pPr>
+            <w:r>
+              <w:rPr>
+                <w:lang w:val="es-ES"/>
+              </w:rPr>
+              <w:t>Nombre: Israel</w:t>
+            </w:r>
+          </w:p>
+          <w:p>
+            <w:pPr>
+              <w:rPr>
+                <w:lang w:val="es-ES"/>
+              </w:rPr>
+            </w:pPr>
             <w:proofErr w:type="spellStart"/>
             <w:r>
               <w:rPr>
                 <w:lang w:val="es-ES"/>
               </w:rPr>
-              <w:t>Model</w:t>
+              <w:t>Pais</w:t>
             </w:r>
             <w:proofErr w:type="spellEnd"/>
             <w:r>
               <w:rPr>
                 <w:lang w:val="es-ES"/>
               </w:rPr>
-              <w:t xml:space="preserve"> S</w:t>
-            </w:r>
-          </w:p>
-          <w:p>
-            <w:pPr>
-              <w:rPr>
-                <w:lang w:val="es-ES"/>
-              </w:rPr>
-            </w:pPr>
-            <w:r>
-              <w:rPr>
-                <w:lang w:val="es-ES"/>
-              </w:rPr>
-              <w:t>Fabricante: Tesla</w:t>
-            </w:r>
-          </w:p>
-          <w:p>
-            <w:pPr>
-              <w:rPr>
-                <w:lang w:val="es-ES"/>
-              </w:rPr>
-            </w:pPr>
-            <w:r>
-              <w:rPr>
-                <w:lang w:val="es-ES"/>
-              </w:rPr>
-              <w:t>Combustible: Eléctrico</w:t>
-            </w:r>
-          </w:p>
-          <w:p>
-            <w:pPr>
-              <w:rPr>
-                <w:lang w:val="es-ES"/>
-              </w:rPr>
-            </w:pPr>
-            <w:r>
-              <w:rPr>
-                <w:lang w:val="es-ES"/>
-              </w:rPr>
-              <w:t>Color: Blanco</w:t>
-            </w:r>
-          </w:p>
-          <w:p>
-            <w:pPr>
-              <w:rPr>
-                <w:lang w:val="es-ES"/>
-              </w:rPr>
-            </w:pPr>
-            <w:r>
-              <w:rPr>
-                <w:lang w:val="es-ES"/>
-              </w:rPr>
-              <w:lastRenderedPageBreak/>
-              <w:t>Modelo: R8</w:t>
-            </w:r>
-          </w:p>
-          <w:p>
-            <w:pPr>
-              <w:rPr>
-                <w:lang w:val="es-ES"/>
-              </w:rPr>
-            </w:pPr>
-            <w:r>
-              <w:rPr>
-                <w:lang w:val="es-ES"/>
-              </w:rPr>
-              <w:t>Fabricante: Audi</w:t>
-            </w:r>
-          </w:p>
-          <w:p>
-            <w:pPr>
-              <w:rPr>
-                <w:lang w:val="es-ES"/>
-              </w:rPr>
-            </w:pPr>
-            <w:r>
-              <w:rPr>
-                <w:lang w:val="es-ES"/>
-              </w:rPr>
-              <w:t>Combustible: Gasolina</w:t>
-            </w:r>
-          </w:p>
-          <w:p>
-            <w:pPr>
-              <w:rPr>
-                <w:lang w:val="es-ES"/>
-              </w:rPr>
-            </w:pPr>
-            <w:r>
-              <w:rPr>
-                <w:lang w:val="es-ES"/>
-              </w:rPr>
-              <w:t>Color: Rojo</w:t>
+              <w:t xml:space="preserve">: </w:t>
+            </w:r>
+            <w:r>
+              <w:rPr>
+                <w:lang w:val="es-ES"/>
+              </w:rPr>
+              <w:t>España</w:t>
+            </w:r>
+          </w:p>
+          <w:p>
+            <w:pPr>
+              <w:rPr>
+                <w:lang w:val="es-ES"/>
+              </w:rPr>
+            </w:pPr>
+            <w:r>
+              <w:rPr>
+                <w:lang w:val="es-ES"/>
+              </w:rPr>
+              <w:t>Tipo de Conductor: Experto</w:t>
             </w:r>
           </w:p>
           <w:p>
@@ -4560,102 +4494,26 @@
                 <w:lang w:val="es-ES"/>
               </w:rPr>
             </w:pPr>
-          </w:p>
-        </w:tc>
-        <w:tc>
-          <w:tcPr>
-            <w:tcW w:w="1930" w:type="dxa"/>
-          </w:tcPr>
-          <w:p>
-            <w:pPr>
-              <w:jc w:val="left"/>
-              <w:rPr>
-                <w:lang w:val="es-ES"/>
-              </w:rPr>
-            </w:pPr>
-          </w:p>
-        </w:tc>
-        <w:tc>
-          <w:tcPr>
-            <w:tcW w:w="1930" w:type="dxa"/>
-          </w:tcPr>
-          <w:p>
-            <w:pPr>
-              <w:rPr>
-                <w:lang w:val="es-ES"/>
-              </w:rPr>
-            </w:pPr>
-            <w:r>
-              <w:rPr>
-                <w:lang w:val="es-ES"/>
-              </w:rPr>
-              <w:t>Nombre: Israel</w:t>
-            </w:r>
-          </w:p>
-          <w:p>
-            <w:pPr>
-              <w:rPr>
-                <w:lang w:val="es-ES"/>
-              </w:rPr>
-            </w:pPr>
-            <w:proofErr w:type="spellStart"/>
-            <w:r>
-              <w:rPr>
-                <w:lang w:val="es-ES"/>
-              </w:rPr>
-              <w:t>Pais</w:t>
-            </w:r>
-            <w:proofErr w:type="spellEnd"/>
-            <w:r>
-              <w:rPr>
-                <w:lang w:val="es-ES"/>
-              </w:rPr>
-              <w:t xml:space="preserve">: </w:t>
-            </w:r>
-            <w:proofErr w:type="spellStart"/>
-            <w:r>
-              <w:rPr>
-                <w:lang w:val="es-ES"/>
-              </w:rPr>
-              <w:t>Spain</w:t>
-            </w:r>
-            <w:proofErr w:type="spellEnd"/>
-          </w:p>
-          <w:p>
-            <w:pPr>
-              <w:rPr>
-                <w:lang w:val="es-ES"/>
-              </w:rPr>
-            </w:pPr>
-            <w:r>
-              <w:rPr>
-                <w:lang w:val="es-ES"/>
-              </w:rPr>
-              <w:t>Tipo de Conductor: Experto</w:t>
-            </w:r>
-          </w:p>
-          <w:p>
-            <w:pPr>
-              <w:jc w:val="left"/>
-              <w:rPr>
-                <w:lang w:val="es-ES"/>
-              </w:rPr>
-            </w:pPr>
-            <w:r>
-              <w:rPr>
-                <w:lang w:val="es-ES"/>
-              </w:rPr>
-              <w:lastRenderedPageBreak/>
+            <w:r>
+              <w:rPr>
+                <w:lang w:val="es-ES"/>
+              </w:rPr>
               <w:t xml:space="preserve">Rating: </w:t>
             </w:r>
-            <w:proofErr w:type="spellStart"/>
-            <w:r>
-              <w:rPr>
-                <w:lang w:val="es-ES"/>
-              </w:rPr>
-              <w:t>null</w:t>
-            </w:r>
-            <w:proofErr w:type="spellEnd"/>
+            <w:proofErr w:type="gramStart"/>
+            <w:r>
+              <w:rPr>
+                <w:lang w:val="es-ES"/>
+              </w:rPr>
+              <w:t>“”/</w:t>
+            </w:r>
+            <w:proofErr w:type="gramEnd"/>
+            <w:r>
+              <w:rPr>
+                <w:lang w:val="es-ES"/>
+              </w:rPr>
+              <w:t>0</w:t>
+            </w:r>
           </w:p>
         </w:tc>
         <w:tc>
@@ -4678,7 +4536,6 @@
               <w:rPr>
                 <w:lang w:val="es-ES"/>
               </w:rPr>
-              <w:lastRenderedPageBreak/>
               <w:t>El sistema notifica del error</w:t>
             </w:r>
           </w:p>
@@ -4845,14 +4702,12 @@
               </w:rPr>
               <w:t xml:space="preserve">: </w:t>
             </w:r>
-            <w:proofErr w:type="spellStart"/>
-            <w:r>
-              <w:rPr>
-                <w:lang w:val="es-ES"/>
-              </w:rPr>
-              <w:t>Spain</w:t>
-            </w:r>
-            <w:proofErr w:type="spellEnd"/>
+            <w:r>
+              <w:rPr>
+                <w:lang w:val="es-ES"/>
+              </w:rPr>
+              <w:t>España</w:t>
+            </w:r>
           </w:p>
           <w:p>
             <w:pPr>
@@ -4927,6 +4782,7 @@
         <w:rPr>
           <w:lang w:val="es-ES"/>
         </w:rPr>
+        <w:lastRenderedPageBreak/>
         <w:t>Necesidades ambientales</w:t>
       </w:r>
       <w:bookmarkEnd w:id="4"/>

</xml_diff>

<commit_message>
He solucionado los problemas que tenia el flujo basico y he sacado todas las pruebas menos la del flujo completo (#349)
</commit_message>
<xml_diff>
--- a/test/AppForSEII2526.UIT/CU_Review/Casos de Prueba Review.docx
+++ b/test/AppForSEII2526.UIT/CU_Review/Casos de Prueba Review.docx
@@ -1673,13 +1673,7 @@
               <w:rPr>
                 <w:lang w:val="es-ES"/>
               </w:rPr>
-              <w:t xml:space="preserve"> - </w:t>
-            </w:r>
-            <w:r>
-              <w:rPr>
-                <w:lang w:val="es-ES"/>
-              </w:rPr>
-              <w:t>No se ha seleccionado ningún coche</w:t>
+              <w:t xml:space="preserve"> - No se ha seleccionado ningún coche</w:t>
             </w:r>
           </w:p>
         </w:tc>
@@ -2182,140 +2176,155 @@
               <w:rPr>
                 <w:lang w:val="es-ES"/>
               </w:rPr>
-              <w:t xml:space="preserve">Modelo: </w:t>
-            </w:r>
+              <w:t>Modelo: Model S</w:t>
+            </w:r>
+          </w:p>
+          <w:p>
+            <w:pPr>
+              <w:rPr>
+                <w:lang w:val="es-ES"/>
+              </w:rPr>
+            </w:pPr>
+            <w:r>
+              <w:rPr>
+                <w:lang w:val="es-ES"/>
+              </w:rPr>
+              <w:t>Fabricante: Tesla</w:t>
+            </w:r>
+          </w:p>
+          <w:p>
+            <w:pPr>
+              <w:rPr>
+                <w:lang w:val="es-ES"/>
+              </w:rPr>
+            </w:pPr>
+            <w:r>
+              <w:rPr>
+                <w:lang w:val="es-ES"/>
+              </w:rPr>
+              <w:t>Combustible: Eléctrico</w:t>
+            </w:r>
+          </w:p>
+          <w:p>
+            <w:pPr>
+              <w:rPr>
+                <w:lang w:val="es-ES"/>
+              </w:rPr>
+            </w:pPr>
+            <w:r>
+              <w:rPr>
+                <w:lang w:val="es-ES"/>
+              </w:rPr>
+              <w:t>Color: Blanco</w:t>
+            </w:r>
+          </w:p>
+          <w:p>
+            <w:pPr>
+              <w:ind w:firstLine="708"/>
+              <w:rPr>
+                <w:lang w:val="es-ES"/>
+              </w:rPr>
+            </w:pPr>
+          </w:p>
+        </w:tc>
+        <w:tc>
+          <w:tcPr>
+            <w:tcW w:w="1930" w:type="dxa"/>
+          </w:tcPr>
+          <w:p>
+            <w:pPr>
+              <w:rPr>
+                <w:lang w:val="es-ES"/>
+              </w:rPr>
+            </w:pPr>
+            <w:r>
+              <w:rPr>
+                <w:lang w:val="es-ES"/>
+              </w:rPr>
+              <w:t>Sin filtro</w:t>
+            </w:r>
+          </w:p>
+        </w:tc>
+        <w:tc>
+          <w:tcPr>
+            <w:tcW w:w="1930" w:type="dxa"/>
+          </w:tcPr>
+          <w:p>
+            <w:pPr>
+              <w:rPr>
+                <w:lang w:val="es-ES"/>
+              </w:rPr>
+            </w:pPr>
+            <w:r>
+              <w:rPr>
+                <w:lang w:val="es-ES"/>
+              </w:rPr>
+              <w:t>Nombre: Israel</w:t>
+            </w:r>
+          </w:p>
+          <w:p>
+            <w:pPr>
+              <w:rPr>
+                <w:lang w:val="es-ES"/>
+              </w:rPr>
+            </w:pPr>
+            <w:r>
+              <w:rPr>
+                <w:lang w:val="es-ES"/>
+              </w:rPr>
+              <w:t>Apellido: Amador</w:t>
+            </w:r>
+          </w:p>
+          <w:p>
+            <w:pPr>
+              <w:rPr>
+                <w:lang w:val="es-ES"/>
+              </w:rPr>
+            </w:pPr>
             <w:proofErr w:type="spellStart"/>
             <w:r>
               <w:rPr>
                 <w:lang w:val="es-ES"/>
               </w:rPr>
-              <w:t>Model</w:t>
+              <w:t>Pais</w:t>
             </w:r>
             <w:proofErr w:type="spellEnd"/>
             <w:r>
               <w:rPr>
                 <w:lang w:val="es-ES"/>
               </w:rPr>
-              <w:t xml:space="preserve"> S</w:t>
-            </w:r>
-          </w:p>
-          <w:p>
-            <w:pPr>
-              <w:rPr>
-                <w:lang w:val="es-ES"/>
-              </w:rPr>
-            </w:pPr>
-            <w:r>
-              <w:rPr>
-                <w:lang w:val="es-ES"/>
-              </w:rPr>
-              <w:t>Fabricante: Tesla</w:t>
-            </w:r>
-          </w:p>
-          <w:p>
-            <w:pPr>
-              <w:rPr>
-                <w:lang w:val="es-ES"/>
-              </w:rPr>
-            </w:pPr>
-            <w:r>
-              <w:rPr>
-                <w:lang w:val="es-ES"/>
-              </w:rPr>
-              <w:t>Combustible: Eléctrico</w:t>
-            </w:r>
-          </w:p>
-          <w:p>
-            <w:pPr>
-              <w:rPr>
-                <w:lang w:val="es-ES"/>
-              </w:rPr>
-            </w:pPr>
-            <w:r>
-              <w:rPr>
-                <w:lang w:val="es-ES"/>
-              </w:rPr>
-              <w:t>Color: Blanco</w:t>
-            </w:r>
-          </w:p>
-          <w:p>
-            <w:pPr>
-              <w:ind w:firstLine="708"/>
-              <w:rPr>
-                <w:lang w:val="es-ES"/>
-              </w:rPr>
-            </w:pPr>
-          </w:p>
-        </w:tc>
-        <w:tc>
-          <w:tcPr>
-            <w:tcW w:w="1930" w:type="dxa"/>
-          </w:tcPr>
-          <w:p>
-            <w:pPr>
-              <w:rPr>
-                <w:lang w:val="es-ES"/>
-              </w:rPr>
-            </w:pPr>
-          </w:p>
-        </w:tc>
-        <w:tc>
-          <w:tcPr>
-            <w:tcW w:w="1930" w:type="dxa"/>
-          </w:tcPr>
-          <w:p>
-            <w:pPr>
-              <w:rPr>
-                <w:lang w:val="es-ES"/>
-              </w:rPr>
-            </w:pPr>
-            <w:r>
-              <w:rPr>
-                <w:lang w:val="es-ES"/>
-              </w:rPr>
-              <w:t>Nombre: Israel</w:t>
-            </w:r>
-          </w:p>
-          <w:p>
-            <w:pPr>
-              <w:rPr>
-                <w:lang w:val="es-ES"/>
-              </w:rPr>
-            </w:pPr>
-            <w:proofErr w:type="spellStart"/>
-            <w:r>
-              <w:rPr>
-                <w:lang w:val="es-ES"/>
-              </w:rPr>
-              <w:t>Pais</w:t>
-            </w:r>
-            <w:proofErr w:type="spellEnd"/>
-            <w:r>
-              <w:rPr>
-                <w:lang w:val="es-ES"/>
-              </w:rPr>
               <w:t xml:space="preserve">: </w:t>
             </w:r>
-            <w:proofErr w:type="spellStart"/>
-            <w:r>
-              <w:rPr>
-                <w:lang w:val="es-ES"/>
-              </w:rPr>
-              <w:t>Spain</w:t>
-            </w:r>
-            <w:proofErr w:type="spellEnd"/>
-          </w:p>
-          <w:p>
-            <w:pPr>
-              <w:rPr>
-                <w:lang w:val="es-ES"/>
-              </w:rPr>
-            </w:pPr>
-            <w:r>
-              <w:rPr>
-                <w:lang w:val="es-ES"/>
-              </w:rPr>
-              <w:t>Tipo de Conductor: Experto</w:t>
+            <w:r>
+              <w:rPr>
+                <w:lang w:val="es-ES"/>
+              </w:rPr>
+              <w:t>España</w:t>
+            </w:r>
+          </w:p>
+          <w:p>
+            <w:pPr>
+              <w:rPr>
+                <w:lang w:val="es-ES"/>
+              </w:rPr>
+            </w:pPr>
+            <w:r>
+              <w:rPr>
+                <w:lang w:val="es-ES"/>
+              </w:rPr>
+              <w:t>Tipo</w:t>
+            </w:r>
+            <w:r>
+              <w:rPr>
+                <w:lang w:val="es-ES"/>
+              </w:rPr>
+              <w:t xml:space="preserve"> </w:t>
+            </w:r>
+            <w:r>
+              <w:rPr>
+                <w:lang w:val="es-ES"/>
+              </w:rPr>
+              <w:t>de Conductor: Experto</w:t>
             </w:r>
           </w:p>
           <w:p>
@@ -2378,7 +2387,21 @@
                 <w:rFonts w:ascii="Arial" w:hAnsi="Arial" w:cs="Arial"/>
                 <w:lang w:val="es-ES"/>
               </w:rPr>
-              <w:t>rá los siguientes datos en el resumen de la compra:</w:t>
+              <w:t xml:space="preserve">rá los siguientes datos en el resumen de la </w:t>
+            </w:r>
+            <w:r>
+              <w:rPr>
+                <w:rFonts w:ascii="Arial" w:hAnsi="Arial" w:cs="Arial"/>
+                <w:lang w:val="es-ES"/>
+              </w:rPr>
+              <w:t>reseña</w:t>
+            </w:r>
+            <w:r>
+              <w:rPr>
+                <w:rFonts w:ascii="Arial" w:hAnsi="Arial" w:cs="Arial"/>
+                <w:lang w:val="es-ES"/>
+              </w:rPr>
+              <w:t>:</w:t>
             </w:r>
           </w:p>
           <w:p>
@@ -2405,29 +2428,7 @@
                 <w:rFonts w:ascii="Arial" w:hAnsi="Arial" w:cs="Arial"/>
                 <w:lang w:val="es-ES"/>
               </w:rPr>
-              <w:t xml:space="preserve"> los coches seleccionados</w:t>
-            </w:r>
-            <w:r>
-              <w:rPr>
-                <w:rFonts w:ascii="Arial" w:hAnsi="Arial" w:cs="Arial"/>
-                <w:lang w:val="es-ES"/>
-              </w:rPr>
-              <w:t>:</w:t>
-            </w:r>
-            <w:r>
-              <w:rPr>
-                <w:rFonts w:ascii="Arial" w:hAnsi="Arial" w:cs="Arial"/>
-                <w:lang w:val="es-ES"/>
-              </w:rPr>
-              <w:t xml:space="preserve"> modelo, fabricante, color, </w:t>
-            </w:r>
-            <w:r>
-              <w:rPr>
-                <w:rFonts w:ascii="Arial" w:hAnsi="Arial" w:cs="Arial"/>
-                <w:lang w:val="es-ES"/>
-              </w:rPr>
-              <w:lastRenderedPageBreak/>
-              <w:t>puntuación y descripción</w:t>
+              <w:t xml:space="preserve"> los coches seleccionados: modelo, fabricante, color, puntuación y descripción</w:t>
             </w:r>
             <w:r>
               <w:rPr>
@@ -2460,28 +2461,15 @@
                 <w:rFonts w:ascii="Arial" w:hAnsi="Arial" w:cs="Arial"/>
                 <w:lang w:val="es-ES"/>
               </w:rPr>
-              <w:t>reseña</w:t>
+              <w:t xml:space="preserve">reseña: nombre, </w:t>
             </w:r>
             <w:r>
               <w:rPr>
                 <w:rFonts w:ascii="Arial" w:hAnsi="Arial" w:cs="Arial"/>
                 <w:lang w:val="es-ES"/>
               </w:rPr>
-              <w:t>:</w:t>
-            </w:r>
-            <w:r>
-              <w:rPr>
-                <w:rFonts w:ascii="Arial" w:hAnsi="Arial" w:cs="Arial"/>
-                <w:lang w:val="es-ES"/>
-              </w:rPr>
-              <w:t xml:space="preserve"> nombre, país, tipo de conductor y fecha en la que se realizó</w:t>
-            </w:r>
-            <w:r>
-              <w:rPr>
-                <w:rFonts w:ascii="Arial" w:hAnsi="Arial" w:cs="Arial"/>
-                <w:lang w:val="es-ES"/>
-              </w:rPr>
-              <w:t xml:space="preserve"> </w:t>
+              <w:lastRenderedPageBreak/>
+              <w:t xml:space="preserve">país, tipo de conductor y fecha en la que se realizó </w:t>
             </w:r>
           </w:p>
         </w:tc>
@@ -2547,134 +2535,124 @@
               <w:rPr>
                 <w:lang w:val="es-ES"/>
               </w:rPr>
-              <w:t xml:space="preserve">Modelo: </w:t>
-            </w:r>
+              <w:t>Modelo: Model S</w:t>
+            </w:r>
+          </w:p>
+          <w:p>
+            <w:pPr>
+              <w:rPr>
+                <w:lang w:val="es-ES"/>
+              </w:rPr>
+            </w:pPr>
+            <w:r>
+              <w:rPr>
+                <w:lang w:val="es-ES"/>
+              </w:rPr>
+              <w:t>Fabricante: Tesla</w:t>
+            </w:r>
+          </w:p>
+          <w:p>
+            <w:pPr>
+              <w:rPr>
+                <w:lang w:val="es-ES"/>
+              </w:rPr>
+            </w:pPr>
+            <w:r>
+              <w:rPr>
+                <w:lang w:val="es-ES"/>
+              </w:rPr>
+              <w:t>Combustible: Eléctrico</w:t>
+            </w:r>
+          </w:p>
+          <w:p>
+            <w:pPr>
+              <w:rPr>
+                <w:lang w:val="es-ES"/>
+              </w:rPr>
+            </w:pPr>
+            <w:r>
+              <w:rPr>
+                <w:lang w:val="es-ES"/>
+              </w:rPr>
+              <w:t>Color: Blanco</w:t>
+            </w:r>
+          </w:p>
+          <w:p>
+            <w:pPr>
+              <w:rPr>
+                <w:lang w:val="es-ES"/>
+              </w:rPr>
+            </w:pPr>
+          </w:p>
+        </w:tc>
+        <w:tc>
+          <w:tcPr>
+            <w:tcW w:w="1930" w:type="dxa"/>
+          </w:tcPr>
+          <w:p>
+            <w:pPr>
+              <w:jc w:val="left"/>
+              <w:rPr>
+                <w:lang w:val="es-ES"/>
+              </w:rPr>
+            </w:pPr>
+            <w:r>
+              <w:rPr>
+                <w:lang w:val="es-ES"/>
+              </w:rPr>
+              <w:t>Tesla/”</w:t>
+            </w:r>
+            <w:r>
+              <w:rPr>
+                <w:lang w:val="es-ES"/>
+              </w:rPr>
+              <w:t>”</w:t>
+            </w:r>
+          </w:p>
+        </w:tc>
+        <w:tc>
+          <w:tcPr>
+            <w:tcW w:w="1930" w:type="dxa"/>
+          </w:tcPr>
+          <w:p>
+            <w:pPr>
+              <w:rPr>
+                <w:lang w:val="es-ES"/>
+              </w:rPr>
+            </w:pPr>
+            <w:r>
+              <w:rPr>
+                <w:lang w:val="es-ES"/>
+              </w:rPr>
+              <w:t>Nombre: Israel</w:t>
+            </w:r>
+          </w:p>
+          <w:p>
+            <w:pPr>
+              <w:rPr>
+                <w:lang w:val="es-ES"/>
+              </w:rPr>
+            </w:pPr>
             <w:proofErr w:type="spellStart"/>
             <w:r>
               <w:rPr>
                 <w:lang w:val="es-ES"/>
               </w:rPr>
-              <w:t>Model</w:t>
+              <w:t>Pais</w:t>
             </w:r>
             <w:proofErr w:type="spellEnd"/>
             <w:r>
               <w:rPr>
                 <w:lang w:val="es-ES"/>
               </w:rPr>
-              <w:t xml:space="preserve"> S</w:t>
-            </w:r>
-          </w:p>
-          <w:p>
-            <w:pPr>
-              <w:rPr>
-                <w:lang w:val="es-ES"/>
-              </w:rPr>
-            </w:pPr>
-            <w:r>
-              <w:rPr>
-                <w:lang w:val="es-ES"/>
-              </w:rPr>
-              <w:t>Fabricante: Tesla</w:t>
-            </w:r>
-          </w:p>
-          <w:p>
-            <w:pPr>
-              <w:rPr>
-                <w:lang w:val="es-ES"/>
-              </w:rPr>
-            </w:pPr>
-            <w:r>
-              <w:rPr>
-                <w:lang w:val="es-ES"/>
-              </w:rPr>
-              <w:t>Combustible: Eléctrico</w:t>
-            </w:r>
-          </w:p>
-          <w:p>
-            <w:pPr>
-              <w:rPr>
-                <w:lang w:val="es-ES"/>
-              </w:rPr>
-            </w:pPr>
-            <w:r>
-              <w:rPr>
-                <w:lang w:val="es-ES"/>
-              </w:rPr>
-              <w:t>Color: Blanco</w:t>
-            </w:r>
-          </w:p>
-          <w:p>
-            <w:pPr>
-              <w:rPr>
-                <w:lang w:val="es-ES"/>
-              </w:rPr>
-            </w:pPr>
-          </w:p>
-        </w:tc>
-        <w:tc>
-          <w:tcPr>
-            <w:tcW w:w="1930" w:type="dxa"/>
-          </w:tcPr>
-          <w:p>
-            <w:pPr>
-              <w:jc w:val="left"/>
-              <w:rPr>
-                <w:lang w:val="es-ES"/>
-              </w:rPr>
-            </w:pPr>
-            <w:r>
-              <w:rPr>
-                <w:lang w:val="es-ES"/>
-              </w:rPr>
-              <w:t>Tesla/””</w:t>
-            </w:r>
-          </w:p>
-        </w:tc>
-        <w:tc>
-          <w:tcPr>
-            <w:tcW w:w="1930" w:type="dxa"/>
-          </w:tcPr>
-          <w:p>
-            <w:pPr>
-              <w:rPr>
-                <w:lang w:val="es-ES"/>
-              </w:rPr>
-            </w:pPr>
-            <w:r>
-              <w:rPr>
-                <w:lang w:val="es-ES"/>
-              </w:rPr>
-              <w:t>Nombre: Israel</w:t>
-            </w:r>
-          </w:p>
-          <w:p>
-            <w:pPr>
-              <w:rPr>
-                <w:lang w:val="es-ES"/>
-              </w:rPr>
-            </w:pPr>
-            <w:proofErr w:type="spellStart"/>
-            <w:r>
-              <w:rPr>
-                <w:lang w:val="es-ES"/>
-              </w:rPr>
-              <w:t>Pais</w:t>
-            </w:r>
-            <w:proofErr w:type="spellEnd"/>
-            <w:r>
-              <w:rPr>
-                <w:lang w:val="es-ES"/>
-              </w:rPr>
               <w:t xml:space="preserve">: </w:t>
             </w:r>
-            <w:proofErr w:type="spellStart"/>
-            <w:r>
-              <w:rPr>
-                <w:lang w:val="es-ES"/>
-              </w:rPr>
-              <w:t>Spain</w:t>
-            </w:r>
-            <w:proofErr w:type="spellEnd"/>
+            <w:r>
+              <w:rPr>
+                <w:lang w:val="es-ES"/>
+              </w:rPr>
+              <w:t>España</w:t>
+            </w:r>
           </w:p>
           <w:p>
             <w:pPr>
@@ -2869,7 +2847,13 @@
               <w:rPr>
                 <w:lang w:val="es-ES"/>
               </w:rPr>
-              <w:t>“”/</w:t>
+              <w:t>“”</w:t>
+            </w:r>
+            <w:r>
+              <w:rPr>
+                <w:lang w:val="es-ES"/>
+              </w:rPr>
+              <w:t>/</w:t>
             </w:r>
             <w:proofErr w:type="gramEnd"/>
             <w:r>
@@ -2915,16 +2899,8 @@
               <w:rPr>
                 <w:lang w:val="es-ES"/>
               </w:rPr>
-              <w:t xml:space="preserve">: </w:t>
-            </w:r>
-            <w:proofErr w:type="spellStart"/>
-            <w:r>
-              <w:rPr>
-                <w:lang w:val="es-ES"/>
-              </w:rPr>
-              <w:t>Spain</w:t>
-            </w:r>
-            <w:proofErr w:type="spellEnd"/>
+              <w:t>: Spain</w:t>
+            </w:r>
           </w:p>
           <w:p>
             <w:pPr>
@@ -3021,7 +2997,13 @@
               <w:rPr>
                 <w:lang w:val="es-ES"/>
               </w:rPr>
-              <w:t xml:space="preserve"> – 3 / No hay coches disponibles</w:t>
+              <w:t xml:space="preserve"> – 3 / </w:t>
+            </w:r>
+            <w:r>
+              <w:rPr>
+                <w:lang w:val="es-ES"/>
+              </w:rPr>
+              <w:t>No hay coches disponibles</w:t>
             </w:r>
           </w:p>
         </w:tc>
@@ -3049,6 +3031,12 @@
                 <w:lang w:val="es-ES"/>
               </w:rPr>
             </w:pPr>
+            <w:r>
+              <w:rPr>
+                <w:lang w:val="es-ES"/>
+              </w:rPr>
+              <w:t>Sin filtro</w:t>
+            </w:r>
           </w:p>
         </w:tc>
         <w:tc>
@@ -3086,16 +3074,8 @@
               <w:rPr>
                 <w:lang w:val="es-ES"/>
               </w:rPr>
-              <w:t xml:space="preserve">: </w:t>
-            </w:r>
-            <w:proofErr w:type="spellStart"/>
-            <w:r>
-              <w:rPr>
-                <w:lang w:val="es-ES"/>
-              </w:rPr>
-              <w:t>Spain</w:t>
-            </w:r>
-            <w:proofErr w:type="spellEnd"/>
+              <w:t>: Spain</w:t>
+            </w:r>
           </w:p>
           <w:p>
             <w:pPr>
@@ -3210,150 +3190,164 @@
               <w:rPr>
                 <w:lang w:val="es-ES"/>
               </w:rPr>
-              <w:t xml:space="preserve">Modelo: </w:t>
-            </w:r>
+              <w:t>Modelo: Model S</w:t>
+            </w:r>
+          </w:p>
+          <w:p>
+            <w:pPr>
+              <w:rPr>
+                <w:lang w:val="es-ES"/>
+              </w:rPr>
+            </w:pPr>
+            <w:r>
+              <w:rPr>
+                <w:lang w:val="es-ES"/>
+              </w:rPr>
+              <w:t>Fabricante: Tesla</w:t>
+            </w:r>
+          </w:p>
+          <w:p>
+            <w:pPr>
+              <w:rPr>
+                <w:lang w:val="es-ES"/>
+              </w:rPr>
+            </w:pPr>
+            <w:r>
+              <w:rPr>
+                <w:lang w:val="es-ES"/>
+              </w:rPr>
+              <w:t>Combustible: Eléctrico</w:t>
+            </w:r>
+          </w:p>
+          <w:p>
+            <w:pPr>
+              <w:rPr>
+                <w:lang w:val="es-ES"/>
+              </w:rPr>
+            </w:pPr>
+            <w:r>
+              <w:rPr>
+                <w:lang w:val="es-ES"/>
+              </w:rPr>
+              <w:t>Color: Blanco</w:t>
+            </w:r>
+          </w:p>
+          <w:p>
+            <w:pPr>
+              <w:rPr>
+                <w:lang w:val="es-ES"/>
+              </w:rPr>
+            </w:pPr>
+          </w:p>
+          <w:p>
+            <w:pPr>
+              <w:rPr>
+                <w:lang w:val="es-ES"/>
+              </w:rPr>
+            </w:pPr>
+            <w:r>
+              <w:rPr>
+                <w:lang w:val="es-ES"/>
+              </w:rPr>
+              <w:t>Modelo: R8</w:t>
+            </w:r>
+          </w:p>
+          <w:p>
+            <w:pPr>
+              <w:rPr>
+                <w:lang w:val="es-ES"/>
+              </w:rPr>
+            </w:pPr>
+            <w:r>
+              <w:rPr>
+                <w:lang w:val="es-ES"/>
+              </w:rPr>
+              <w:t>Fabricante: Audi</w:t>
+            </w:r>
+          </w:p>
+          <w:p>
+            <w:pPr>
+              <w:rPr>
+                <w:lang w:val="es-ES"/>
+              </w:rPr>
+            </w:pPr>
+            <w:r>
+              <w:rPr>
+                <w:lang w:val="es-ES"/>
+              </w:rPr>
+              <w:t>Combustible: Gasolina</w:t>
+            </w:r>
+          </w:p>
+          <w:p>
+            <w:pPr>
+              <w:rPr>
+                <w:lang w:val="es-ES"/>
+              </w:rPr>
+            </w:pPr>
+            <w:r>
+              <w:rPr>
+                <w:lang w:val="es-ES"/>
+              </w:rPr>
+              <w:t>Color: Rojo</w:t>
+            </w:r>
+          </w:p>
+        </w:tc>
+        <w:tc>
+          <w:tcPr>
+            <w:tcW w:w="1930" w:type="dxa"/>
+          </w:tcPr>
+          <w:p>
+            <w:pPr>
+              <w:jc w:val="left"/>
+              <w:rPr>
+                <w:lang w:val="es-ES"/>
+              </w:rPr>
+            </w:pPr>
+          </w:p>
+        </w:tc>
+        <w:tc>
+          <w:tcPr>
+            <w:tcW w:w="1930" w:type="dxa"/>
+          </w:tcPr>
+          <w:p>
+            <w:pPr>
+              <w:rPr>
+                <w:lang w:val="es-ES"/>
+              </w:rPr>
+            </w:pPr>
+            <w:r>
+              <w:rPr>
+                <w:lang w:val="es-ES"/>
+              </w:rPr>
+              <w:t>Nombre: Israel</w:t>
+            </w:r>
+          </w:p>
+          <w:p>
+            <w:pPr>
+              <w:rPr>
+                <w:lang w:val="es-ES"/>
+              </w:rPr>
+            </w:pPr>
             <w:proofErr w:type="spellStart"/>
             <w:r>
               <w:rPr>
                 <w:lang w:val="es-ES"/>
               </w:rPr>
-              <w:t>Model</w:t>
+              <w:t>Pais</w:t>
             </w:r>
             <w:proofErr w:type="spellEnd"/>
             <w:r>
               <w:rPr>
                 <w:lang w:val="es-ES"/>
               </w:rPr>
-              <w:t xml:space="preserve"> S</w:t>
-            </w:r>
-          </w:p>
-          <w:p>
-            <w:pPr>
-              <w:rPr>
-                <w:lang w:val="es-ES"/>
-              </w:rPr>
-            </w:pPr>
-            <w:r>
-              <w:rPr>
-                <w:lang w:val="es-ES"/>
-              </w:rPr>
-              <w:t>Fabricante: Tesla</w:t>
-            </w:r>
-          </w:p>
-          <w:p>
-            <w:pPr>
-              <w:rPr>
-                <w:lang w:val="es-ES"/>
-              </w:rPr>
-            </w:pPr>
-            <w:r>
-              <w:rPr>
-                <w:lang w:val="es-ES"/>
-              </w:rPr>
-              <w:t>Combustible: Eléctrico</w:t>
-            </w:r>
-          </w:p>
-          <w:p>
-            <w:pPr>
-              <w:rPr>
-                <w:lang w:val="es-ES"/>
-              </w:rPr>
-            </w:pPr>
-            <w:r>
-              <w:rPr>
-                <w:lang w:val="es-ES"/>
-              </w:rPr>
-              <w:t>Color: Blanco</w:t>
-            </w:r>
-          </w:p>
-          <w:p>
-            <w:pPr>
-              <w:rPr>
-                <w:lang w:val="es-ES"/>
-              </w:rPr>
-            </w:pPr>
-            <w:r>
-              <w:rPr>
-                <w:lang w:val="es-ES"/>
-              </w:rPr>
-              <w:t>Color: Rojo</w:t>
-            </w:r>
-          </w:p>
-          <w:p>
-            <w:pPr>
-              <w:jc w:val="left"/>
-              <w:rPr>
-                <w:lang w:val="es-ES"/>
-              </w:rPr>
-            </w:pPr>
-          </w:p>
-          <w:p>
-            <w:pPr>
-              <w:jc w:val="left"/>
-              <w:rPr>
-                <w:lang w:val="es-ES"/>
-              </w:rPr>
-            </w:pPr>
-          </w:p>
-        </w:tc>
-        <w:tc>
-          <w:tcPr>
-            <w:tcW w:w="1930" w:type="dxa"/>
-          </w:tcPr>
-          <w:p>
-            <w:pPr>
-              <w:jc w:val="left"/>
-              <w:rPr>
-                <w:lang w:val="es-ES"/>
-              </w:rPr>
-            </w:pPr>
-          </w:p>
-        </w:tc>
-        <w:tc>
-          <w:tcPr>
-            <w:tcW w:w="1930" w:type="dxa"/>
-          </w:tcPr>
-          <w:p>
-            <w:pPr>
-              <w:rPr>
-                <w:lang w:val="es-ES"/>
-              </w:rPr>
-            </w:pPr>
-            <w:r>
-              <w:rPr>
-                <w:lang w:val="es-ES"/>
-              </w:rPr>
-              <w:t>Nombre: Israel</w:t>
-            </w:r>
-          </w:p>
-          <w:p>
-            <w:pPr>
-              <w:rPr>
-                <w:lang w:val="es-ES"/>
-              </w:rPr>
-            </w:pPr>
-            <w:proofErr w:type="spellStart"/>
-            <w:r>
-              <w:rPr>
-                <w:lang w:val="es-ES"/>
-              </w:rPr>
-              <w:t>Pais</w:t>
-            </w:r>
-            <w:proofErr w:type="spellEnd"/>
-            <w:r>
-              <w:rPr>
-                <w:lang w:val="es-ES"/>
-              </w:rPr>
               <w:t xml:space="preserve">: </w:t>
             </w:r>
-            <w:proofErr w:type="spellStart"/>
-            <w:r>
-              <w:rPr>
-                <w:lang w:val="es-ES"/>
-              </w:rPr>
-              <w:t>Spain</w:t>
-            </w:r>
-            <w:proofErr w:type="spellEnd"/>
+            <w:r>
+              <w:rPr>
+                <w:lang w:val="es-ES"/>
+              </w:rPr>
+              <w:t>España</w:t>
+            </w:r>
           </w:p>
           <w:p>
             <w:pPr>
@@ -3423,15 +3417,154 @@
               <w:rPr>
                 <w:lang w:val="es-ES"/>
               </w:rPr>
+              <w:t>UC4_6</w:t>
+            </w:r>
+          </w:p>
+        </w:tc>
+        <w:tc>
+          <w:tcPr>
+            <w:tcW w:w="2208" w:type="dxa"/>
+          </w:tcPr>
+          <w:p>
+            <w:pPr>
+              <w:jc w:val="left"/>
+              <w:rPr>
+                <w:lang w:val="es-ES"/>
+              </w:rPr>
+            </w:pPr>
+            <w:proofErr w:type="spellStart"/>
+            <w:r>
+              <w:rPr>
+                <w:lang w:val="es-ES"/>
+              </w:rPr>
+              <w:t>Esc</w:t>
+            </w:r>
+            <w:proofErr w:type="spellEnd"/>
+            <w:r>
+              <w:rPr>
+                <w:lang w:val="es-ES"/>
+              </w:rPr>
+              <w:t xml:space="preserve"> – 5 / Nombre </w:t>
+            </w:r>
+            <w:proofErr w:type="spellStart"/>
+            <w:r>
+              <w:rPr>
+                <w:lang w:val="es-ES"/>
+              </w:rPr>
+              <w:t>erroneo</w:t>
+            </w:r>
+            <w:proofErr w:type="spellEnd"/>
+          </w:p>
+        </w:tc>
+        <w:tc>
+          <w:tcPr>
+            <w:tcW w:w="2039" w:type="dxa"/>
+          </w:tcPr>
+          <w:p>
+            <w:pPr>
+              <w:rPr>
+                <w:lang w:val="es-ES"/>
+              </w:rPr>
+            </w:pPr>
+            <w:r>
+              <w:rPr>
+                <w:lang w:val="es-ES"/>
+              </w:rPr>
+              <w:t>Modelo: Model S</w:t>
+            </w:r>
+          </w:p>
+          <w:p>
+            <w:pPr>
+              <w:rPr>
+                <w:lang w:val="es-ES"/>
+              </w:rPr>
+            </w:pPr>
+            <w:r>
+              <w:rPr>
+                <w:lang w:val="es-ES"/>
+              </w:rPr>
+              <w:t>Fabricante: Tesla</w:t>
+            </w:r>
+          </w:p>
+          <w:p>
+            <w:pPr>
+              <w:rPr>
+                <w:lang w:val="es-ES"/>
+              </w:rPr>
+            </w:pPr>
+            <w:r>
+              <w:rPr>
+                <w:lang w:val="es-ES"/>
+              </w:rPr>
+              <w:t>Combustible: Eléctrico</w:t>
+            </w:r>
+          </w:p>
+          <w:p>
+            <w:pPr>
+              <w:rPr>
+                <w:lang w:val="es-ES"/>
+              </w:rPr>
+            </w:pPr>
+            <w:r>
+              <w:rPr>
+                <w:lang w:val="es-ES"/>
+              </w:rPr>
+              <w:t>Color: Blanco</w:t>
+            </w:r>
+          </w:p>
+          <w:p>
+            <w:pPr>
+              <w:rPr>
+                <w:lang w:val="es-ES"/>
+              </w:rPr>
+            </w:pPr>
+            <w:r>
+              <w:rPr>
+                <w:lang w:val="es-ES"/>
+              </w:rPr>
+              <w:t>Modelo: R8</w:t>
+            </w:r>
+          </w:p>
+          <w:p>
+            <w:pPr>
+              <w:rPr>
+                <w:lang w:val="es-ES"/>
+              </w:rPr>
+            </w:pPr>
+            <w:r>
+              <w:rPr>
+                <w:lang w:val="es-ES"/>
+              </w:rPr>
+              <w:t>Fabricante: Audi</w:t>
+            </w:r>
+          </w:p>
+          <w:p>
+            <w:pPr>
+              <w:rPr>
+                <w:lang w:val="es-ES"/>
+              </w:rPr>
+            </w:pPr>
+            <w:r>
+              <w:rPr>
+                <w:lang w:val="es-ES"/>
+              </w:rPr>
+              <w:t>Combustible: Gasolina</w:t>
+            </w:r>
+          </w:p>
+          <w:p>
+            <w:pPr>
+              <w:rPr>
+                <w:lang w:val="es-ES"/>
+              </w:rPr>
+            </w:pPr>
+            <w:r>
+              <w:rPr>
+                <w:lang w:val="es-ES"/>
+              </w:rPr>
               <w:lastRenderedPageBreak/>
-              <w:t>UC4_6</w:t>
-            </w:r>
-          </w:p>
-        </w:tc>
-        <w:tc>
-          <w:tcPr>
-            <w:tcW w:w="2208" w:type="dxa"/>
-          </w:tcPr>
+              <w:t>Color: Rojo</w:t>
+            </w:r>
+          </w:p>
           <w:p>
             <w:pPr>
               <w:jc w:val="left"/>
@@ -3439,225 +3572,64 @@
                 <w:lang w:val="es-ES"/>
               </w:rPr>
             </w:pPr>
+          </w:p>
+        </w:tc>
+        <w:tc>
+          <w:tcPr>
+            <w:tcW w:w="1930" w:type="dxa"/>
+          </w:tcPr>
+          <w:p>
+            <w:pPr>
+              <w:jc w:val="left"/>
+              <w:rPr>
+                <w:lang w:val="es-ES"/>
+              </w:rPr>
+            </w:pPr>
+          </w:p>
+        </w:tc>
+        <w:tc>
+          <w:tcPr>
+            <w:tcW w:w="1930" w:type="dxa"/>
+          </w:tcPr>
+          <w:p>
+            <w:pPr>
+              <w:rPr>
+                <w:lang w:val="es-ES"/>
+              </w:rPr>
+            </w:pPr>
+            <w:r>
+              <w:rPr>
+                <w:lang w:val="es-ES"/>
+              </w:rPr>
+              <w:t>Nombre: “”</w:t>
+            </w:r>
+          </w:p>
+          <w:p>
+            <w:pPr>
+              <w:rPr>
+                <w:lang w:val="es-ES"/>
+              </w:rPr>
+            </w:pPr>
             <w:proofErr w:type="spellStart"/>
             <w:r>
               <w:rPr>
                 <w:lang w:val="es-ES"/>
               </w:rPr>
-              <w:t>Esc</w:t>
+              <w:t>Pais</w:t>
             </w:r>
             <w:proofErr w:type="spellEnd"/>
             <w:r>
               <w:rPr>
                 <w:lang w:val="es-ES"/>
               </w:rPr>
-              <w:t xml:space="preserve"> – 5 / Nombre </w:t>
-            </w:r>
-            <w:proofErr w:type="spellStart"/>
-            <w:r>
-              <w:rPr>
-                <w:lang w:val="es-ES"/>
-              </w:rPr>
-              <w:t>erroneo</w:t>
-            </w:r>
-            <w:proofErr w:type="spellEnd"/>
-          </w:p>
-        </w:tc>
-        <w:tc>
-          <w:tcPr>
-            <w:tcW w:w="2039" w:type="dxa"/>
-          </w:tcPr>
-          <w:p>
-            <w:pPr>
-              <w:rPr>
-                <w:lang w:val="es-ES"/>
-              </w:rPr>
-            </w:pPr>
-            <w:r>
-              <w:rPr>
-                <w:lang w:val="es-ES"/>
-              </w:rPr>
-              <w:t xml:space="preserve">Modelo: </w:t>
-            </w:r>
-            <w:proofErr w:type="spellStart"/>
-            <w:r>
-              <w:rPr>
-                <w:lang w:val="es-ES"/>
-              </w:rPr>
-              <w:t>Model</w:t>
-            </w:r>
-            <w:proofErr w:type="spellEnd"/>
-            <w:r>
-              <w:rPr>
-                <w:lang w:val="es-ES"/>
-              </w:rPr>
-              <w:t xml:space="preserve"> S</w:t>
-            </w:r>
-          </w:p>
-          <w:p>
-            <w:pPr>
-              <w:rPr>
-                <w:lang w:val="es-ES"/>
-              </w:rPr>
-            </w:pPr>
-            <w:r>
-              <w:rPr>
-                <w:lang w:val="es-ES"/>
-              </w:rPr>
-              <w:t>Fabricante: Tesla</w:t>
-            </w:r>
-          </w:p>
-          <w:p>
-            <w:pPr>
-              <w:rPr>
-                <w:lang w:val="es-ES"/>
-              </w:rPr>
-            </w:pPr>
-            <w:r>
-              <w:rPr>
-                <w:lang w:val="es-ES"/>
-              </w:rPr>
-              <w:t>Combustible: Eléctrico</w:t>
-            </w:r>
-          </w:p>
-          <w:p>
-            <w:pPr>
-              <w:rPr>
-                <w:lang w:val="es-ES"/>
-              </w:rPr>
-            </w:pPr>
-            <w:r>
-              <w:rPr>
-                <w:lang w:val="es-ES"/>
-              </w:rPr>
-              <w:t>Color: Blanco</w:t>
-            </w:r>
-          </w:p>
-          <w:p>
-            <w:pPr>
-              <w:rPr>
-                <w:lang w:val="es-ES"/>
-              </w:rPr>
-            </w:pPr>
-            <w:r>
-              <w:rPr>
-                <w:lang w:val="es-ES"/>
-              </w:rPr>
-              <w:t>Modelo: R8</w:t>
-            </w:r>
-          </w:p>
-          <w:p>
-            <w:pPr>
-              <w:rPr>
-                <w:lang w:val="es-ES"/>
-              </w:rPr>
-            </w:pPr>
-            <w:r>
-              <w:rPr>
-                <w:lang w:val="es-ES"/>
-              </w:rPr>
-              <w:t>Fabricante: Audi</w:t>
-            </w:r>
-          </w:p>
-          <w:p>
-            <w:pPr>
-              <w:rPr>
-                <w:lang w:val="es-ES"/>
-              </w:rPr>
-            </w:pPr>
-            <w:r>
-              <w:rPr>
-                <w:lang w:val="es-ES"/>
-              </w:rPr>
-              <w:t>Combustible: Gasolina</w:t>
-            </w:r>
-          </w:p>
-          <w:p>
-            <w:pPr>
-              <w:rPr>
-                <w:lang w:val="es-ES"/>
-              </w:rPr>
-            </w:pPr>
-            <w:r>
-              <w:rPr>
-                <w:lang w:val="es-ES"/>
-              </w:rPr>
-              <w:t>Color: Rojo</w:t>
-            </w:r>
-          </w:p>
-          <w:p>
-            <w:pPr>
-              <w:jc w:val="left"/>
-              <w:rPr>
-                <w:lang w:val="es-ES"/>
-              </w:rPr>
-            </w:pPr>
-          </w:p>
-        </w:tc>
-        <w:tc>
-          <w:tcPr>
-            <w:tcW w:w="1930" w:type="dxa"/>
-          </w:tcPr>
-          <w:p>
-            <w:pPr>
-              <w:jc w:val="left"/>
-              <w:rPr>
-                <w:lang w:val="es-ES"/>
-              </w:rPr>
-            </w:pPr>
-          </w:p>
-        </w:tc>
-        <w:tc>
-          <w:tcPr>
-            <w:tcW w:w="1930" w:type="dxa"/>
-          </w:tcPr>
-          <w:p>
-            <w:pPr>
-              <w:rPr>
-                <w:lang w:val="es-ES"/>
-              </w:rPr>
-            </w:pPr>
-            <w:r>
-              <w:rPr>
-                <w:lang w:val="es-ES"/>
-              </w:rPr>
-              <w:t xml:space="preserve">Nombre: </w:t>
-            </w:r>
-            <w:r>
-              <w:rPr>
-                <w:lang w:val="es-ES"/>
-              </w:rPr>
-              <w:t>“”</w:t>
-            </w:r>
-          </w:p>
-          <w:p>
-            <w:pPr>
-              <w:rPr>
-                <w:lang w:val="es-ES"/>
-              </w:rPr>
-            </w:pPr>
-            <w:proofErr w:type="spellStart"/>
-            <w:r>
-              <w:rPr>
-                <w:lang w:val="es-ES"/>
-              </w:rPr>
-              <w:t>Pais</w:t>
-            </w:r>
-            <w:proofErr w:type="spellEnd"/>
-            <w:r>
-              <w:rPr>
-                <w:lang w:val="es-ES"/>
-              </w:rPr>
               <w:t xml:space="preserve">: </w:t>
             </w:r>
-            <w:proofErr w:type="spellStart"/>
-            <w:r>
-              <w:rPr>
-                <w:lang w:val="es-ES"/>
-              </w:rPr>
-              <w:t>Spain</w:t>
-            </w:r>
-            <w:proofErr w:type="spellEnd"/>
+            <w:r>
+              <w:rPr>
+                <w:lang w:val="es-ES"/>
+              </w:rPr>
+              <w:t>España</w:t>
+            </w:r>
           </w:p>
           <w:p>
             <w:pPr>
@@ -3754,25 +3726,7 @@
               <w:rPr>
                 <w:lang w:val="es-ES"/>
               </w:rPr>
-              <w:t xml:space="preserve"> </w:t>
-            </w:r>
-            <w:r>
-              <w:rPr>
-                <w:lang w:val="es-ES"/>
-              </w:rPr>
-              <w:t>–</w:t>
-            </w:r>
-            <w:r>
-              <w:rPr>
-                <w:lang w:val="es-ES"/>
-              </w:rPr>
-              <w:t xml:space="preserve"> 5</w:t>
-            </w:r>
-            <w:r>
-              <w:rPr>
-                <w:lang w:val="es-ES"/>
-              </w:rPr>
-              <w:t xml:space="preserve"> / País </w:t>
+              <w:t xml:space="preserve"> – 5 / País </w:t>
             </w:r>
             <w:proofErr w:type="spellStart"/>
             <w:r>
@@ -3798,178 +3752,158 @@
               <w:rPr>
                 <w:lang w:val="es-ES"/>
               </w:rPr>
-              <w:t xml:space="preserve">Modelo: </w:t>
-            </w:r>
+              <w:t>Modelo: Model S</w:t>
+            </w:r>
+          </w:p>
+          <w:p>
+            <w:pPr>
+              <w:rPr>
+                <w:lang w:val="es-ES"/>
+              </w:rPr>
+            </w:pPr>
+            <w:r>
+              <w:rPr>
+                <w:lang w:val="es-ES"/>
+              </w:rPr>
+              <w:t>Fabricante: Tesla</w:t>
+            </w:r>
+          </w:p>
+          <w:p>
+            <w:pPr>
+              <w:rPr>
+                <w:lang w:val="es-ES"/>
+              </w:rPr>
+            </w:pPr>
+            <w:r>
+              <w:rPr>
+                <w:lang w:val="es-ES"/>
+              </w:rPr>
+              <w:t>Combustible: Eléctrico</w:t>
+            </w:r>
+          </w:p>
+          <w:p>
+            <w:pPr>
+              <w:rPr>
+                <w:lang w:val="es-ES"/>
+              </w:rPr>
+            </w:pPr>
+            <w:r>
+              <w:rPr>
+                <w:lang w:val="es-ES"/>
+              </w:rPr>
+              <w:t>Color: Blanco</w:t>
+            </w:r>
+          </w:p>
+          <w:p>
+            <w:pPr>
+              <w:rPr>
+                <w:lang w:val="es-ES"/>
+              </w:rPr>
+            </w:pPr>
+            <w:r>
+              <w:rPr>
+                <w:lang w:val="es-ES"/>
+              </w:rPr>
+              <w:t>Modelo: R8</w:t>
+            </w:r>
+          </w:p>
+          <w:p>
+            <w:pPr>
+              <w:rPr>
+                <w:lang w:val="es-ES"/>
+              </w:rPr>
+            </w:pPr>
+            <w:r>
+              <w:rPr>
+                <w:lang w:val="es-ES"/>
+              </w:rPr>
+              <w:t>Fabricante: Audi</w:t>
+            </w:r>
+          </w:p>
+          <w:p>
+            <w:pPr>
+              <w:rPr>
+                <w:lang w:val="es-ES"/>
+              </w:rPr>
+            </w:pPr>
+            <w:r>
+              <w:rPr>
+                <w:lang w:val="es-ES"/>
+              </w:rPr>
+              <w:t>Combustible: Gasolina</w:t>
+            </w:r>
+          </w:p>
+          <w:p>
+            <w:pPr>
+              <w:rPr>
+                <w:lang w:val="es-ES"/>
+              </w:rPr>
+            </w:pPr>
+            <w:r>
+              <w:rPr>
+                <w:lang w:val="es-ES"/>
+              </w:rPr>
+              <w:t>Color: Rojo</w:t>
+            </w:r>
+          </w:p>
+          <w:p>
+            <w:pPr>
+              <w:jc w:val="left"/>
+              <w:rPr>
+                <w:lang w:val="es-ES"/>
+              </w:rPr>
+            </w:pPr>
+          </w:p>
+        </w:tc>
+        <w:tc>
+          <w:tcPr>
+            <w:tcW w:w="1930" w:type="dxa"/>
+          </w:tcPr>
+          <w:p>
+            <w:pPr>
+              <w:jc w:val="left"/>
+              <w:rPr>
+                <w:lang w:val="es-ES"/>
+              </w:rPr>
+            </w:pPr>
+          </w:p>
+        </w:tc>
+        <w:tc>
+          <w:tcPr>
+            <w:tcW w:w="1930" w:type="dxa"/>
+          </w:tcPr>
+          <w:p>
+            <w:pPr>
+              <w:rPr>
+                <w:lang w:val="es-ES"/>
+              </w:rPr>
+            </w:pPr>
+            <w:r>
+              <w:rPr>
+                <w:lang w:val="es-ES"/>
+              </w:rPr>
+              <w:t>Nombre: Israel</w:t>
+            </w:r>
+          </w:p>
+          <w:p>
+            <w:pPr>
+              <w:rPr>
+                <w:lang w:val="es-ES"/>
+              </w:rPr>
+            </w:pPr>
             <w:proofErr w:type="spellStart"/>
             <w:r>
               <w:rPr>
                 <w:lang w:val="es-ES"/>
               </w:rPr>
-              <w:t>Model</w:t>
+              <w:t>Pais</w:t>
             </w:r>
             <w:proofErr w:type="spellEnd"/>
             <w:r>
               <w:rPr>
                 <w:lang w:val="es-ES"/>
               </w:rPr>
-              <w:t xml:space="preserve"> S</w:t>
-            </w:r>
-          </w:p>
-          <w:p>
-            <w:pPr>
-              <w:rPr>
-                <w:lang w:val="es-ES"/>
-              </w:rPr>
-            </w:pPr>
-            <w:r>
-              <w:rPr>
-                <w:lang w:val="es-ES"/>
-              </w:rPr>
-              <w:t>Fabricante: Tesla</w:t>
-            </w:r>
-          </w:p>
-          <w:p>
-            <w:pPr>
-              <w:rPr>
-                <w:lang w:val="es-ES"/>
-              </w:rPr>
-            </w:pPr>
-            <w:r>
-              <w:rPr>
-                <w:lang w:val="es-ES"/>
-              </w:rPr>
-              <w:t>Combustible: Eléctrico</w:t>
-            </w:r>
-          </w:p>
-          <w:p>
-            <w:pPr>
-              <w:rPr>
-                <w:lang w:val="es-ES"/>
-              </w:rPr>
-            </w:pPr>
-            <w:r>
-              <w:rPr>
-                <w:lang w:val="es-ES"/>
-              </w:rPr>
-              <w:t>Color: Blanco</w:t>
-            </w:r>
-          </w:p>
-          <w:p>
-            <w:pPr>
-              <w:rPr>
-                <w:lang w:val="es-ES"/>
-              </w:rPr>
-            </w:pPr>
-            <w:r>
-              <w:rPr>
-                <w:lang w:val="es-ES"/>
-              </w:rPr>
-              <w:t>Modelo: R8</w:t>
-            </w:r>
-          </w:p>
-          <w:p>
-            <w:pPr>
-              <w:rPr>
-                <w:lang w:val="es-ES"/>
-              </w:rPr>
-            </w:pPr>
-            <w:r>
-              <w:rPr>
-                <w:lang w:val="es-ES"/>
-              </w:rPr>
-              <w:t>Fabricante: Audi</w:t>
-            </w:r>
-          </w:p>
-          <w:p>
-            <w:pPr>
-              <w:rPr>
-                <w:lang w:val="es-ES"/>
-              </w:rPr>
-            </w:pPr>
-            <w:r>
-              <w:rPr>
-                <w:lang w:val="es-ES"/>
-              </w:rPr>
-              <w:t>Combustible: Gasolina</w:t>
-            </w:r>
-          </w:p>
-          <w:p>
-            <w:pPr>
-              <w:rPr>
-                <w:lang w:val="es-ES"/>
-              </w:rPr>
-            </w:pPr>
-            <w:r>
-              <w:rPr>
-                <w:lang w:val="es-ES"/>
-              </w:rPr>
-              <w:t>Color: Rojo</w:t>
-            </w:r>
-          </w:p>
-          <w:p>
-            <w:pPr>
-              <w:jc w:val="left"/>
-              <w:rPr>
-                <w:lang w:val="es-ES"/>
-              </w:rPr>
-            </w:pPr>
-          </w:p>
-        </w:tc>
-        <w:tc>
-          <w:tcPr>
-            <w:tcW w:w="1930" w:type="dxa"/>
-          </w:tcPr>
-          <w:p>
-            <w:pPr>
-              <w:jc w:val="left"/>
-              <w:rPr>
-                <w:lang w:val="es-ES"/>
-              </w:rPr>
-            </w:pPr>
-          </w:p>
-        </w:tc>
-        <w:tc>
-          <w:tcPr>
-            <w:tcW w:w="1930" w:type="dxa"/>
-          </w:tcPr>
-          <w:p>
-            <w:pPr>
-              <w:rPr>
-                <w:lang w:val="es-ES"/>
-              </w:rPr>
-            </w:pPr>
-            <w:r>
-              <w:rPr>
-                <w:lang w:val="es-ES"/>
-              </w:rPr>
-              <w:t>Nombre: Israel</w:t>
-            </w:r>
-          </w:p>
-          <w:p>
-            <w:pPr>
-              <w:rPr>
-                <w:lang w:val="es-ES"/>
-              </w:rPr>
-            </w:pPr>
-            <w:proofErr w:type="spellStart"/>
-            <w:r>
-              <w:rPr>
-                <w:lang w:val="es-ES"/>
-              </w:rPr>
-              <w:t>Pais</w:t>
-            </w:r>
-            <w:proofErr w:type="spellEnd"/>
-            <w:r>
-              <w:rPr>
-                <w:lang w:val="es-ES"/>
-              </w:rPr>
-              <w:t xml:space="preserve">: </w:t>
-            </w:r>
-            <w:r>
-              <w:rPr>
-                <w:lang w:val="es-ES"/>
-              </w:rPr>
-              <w:t>“”</w:t>
+              <w:t>: “”</w:t>
             </w:r>
           </w:p>
           <w:p>
@@ -4067,44 +4001,20 @@
               <w:rPr>
                 <w:lang w:val="es-ES"/>
               </w:rPr>
-              <w:t xml:space="preserve"> </w:t>
-            </w:r>
-            <w:r>
-              <w:rPr>
-                <w:lang w:val="es-ES"/>
-              </w:rPr>
-              <w:t>–</w:t>
-            </w:r>
-            <w:r>
-              <w:rPr>
-                <w:lang w:val="es-ES"/>
-              </w:rPr>
-              <w:t xml:space="preserve"> 5</w:t>
-            </w:r>
-            <w:r>
-              <w:rPr>
-                <w:lang w:val="es-ES"/>
-              </w:rPr>
-              <w:t xml:space="preserve"> / </w:t>
-            </w:r>
-            <w:r>
-              <w:rPr>
-                <w:lang w:val="es-ES"/>
-              </w:rPr>
-              <w:t>Tipo de conductor</w:t>
-            </w:r>
-            <w:r>
-              <w:rPr>
-                <w:lang w:val="es-ES"/>
-              </w:rPr>
-              <w:t xml:space="preserve"> </w:t>
+              <w:t xml:space="preserve"> – 5 / Tipo de conductor </w:t>
+            </w:r>
+            <w:r>
+              <w:rPr>
+                <w:lang w:val="es-ES"/>
+              </w:rPr>
+              <w:t xml:space="preserve">obligatorio </w:t>
             </w:r>
             <w:proofErr w:type="spellStart"/>
             <w:r>
               <w:rPr>
                 <w:lang w:val="es-ES"/>
               </w:rPr>
-              <w:t>erroneo</w:t>
+              <w:t>vacio</w:t>
             </w:r>
             <w:proofErr w:type="spellEnd"/>
           </w:p>
@@ -4123,199 +4033,177 @@
               <w:rPr>
                 <w:lang w:val="es-ES"/>
               </w:rPr>
-              <w:t xml:space="preserve">Modelo: </w:t>
-            </w:r>
+              <w:t>Modelo: Model S</w:t>
+            </w:r>
+          </w:p>
+          <w:p>
+            <w:pPr>
+              <w:rPr>
+                <w:lang w:val="es-ES"/>
+              </w:rPr>
+            </w:pPr>
+            <w:r>
+              <w:rPr>
+                <w:lang w:val="es-ES"/>
+              </w:rPr>
+              <w:t>Fabricante: Tesla</w:t>
+            </w:r>
+          </w:p>
+          <w:p>
+            <w:pPr>
+              <w:rPr>
+                <w:lang w:val="es-ES"/>
+              </w:rPr>
+            </w:pPr>
+            <w:r>
+              <w:rPr>
+                <w:lang w:val="es-ES"/>
+              </w:rPr>
+              <w:t>Combustible: Eléctrico</w:t>
+            </w:r>
+          </w:p>
+          <w:p>
+            <w:pPr>
+              <w:rPr>
+                <w:lang w:val="es-ES"/>
+              </w:rPr>
+            </w:pPr>
+            <w:r>
+              <w:rPr>
+                <w:lang w:val="es-ES"/>
+              </w:rPr>
+              <w:t>Color: Blanco</w:t>
+            </w:r>
+          </w:p>
+          <w:p>
+            <w:pPr>
+              <w:rPr>
+                <w:lang w:val="es-ES"/>
+              </w:rPr>
+            </w:pPr>
+            <w:r>
+              <w:rPr>
+                <w:lang w:val="es-ES"/>
+              </w:rPr>
+              <w:t>Modelo: R8</w:t>
+            </w:r>
+          </w:p>
+          <w:p>
+            <w:pPr>
+              <w:rPr>
+                <w:lang w:val="es-ES"/>
+              </w:rPr>
+            </w:pPr>
+            <w:r>
+              <w:rPr>
+                <w:lang w:val="es-ES"/>
+              </w:rPr>
+              <w:t>Fabricante: Audi</w:t>
+            </w:r>
+          </w:p>
+          <w:p>
+            <w:pPr>
+              <w:rPr>
+                <w:lang w:val="es-ES"/>
+              </w:rPr>
+            </w:pPr>
+            <w:r>
+              <w:rPr>
+                <w:lang w:val="es-ES"/>
+              </w:rPr>
+              <w:t>Combustible: Gasolina</w:t>
+            </w:r>
+          </w:p>
+          <w:p>
+            <w:pPr>
+              <w:rPr>
+                <w:lang w:val="es-ES"/>
+              </w:rPr>
+            </w:pPr>
+            <w:r>
+              <w:rPr>
+                <w:lang w:val="es-ES"/>
+              </w:rPr>
+              <w:t>Color: Rojo</w:t>
+            </w:r>
+          </w:p>
+          <w:p>
+            <w:pPr>
+              <w:jc w:val="left"/>
+              <w:rPr>
+                <w:lang w:val="es-ES"/>
+              </w:rPr>
+            </w:pPr>
+          </w:p>
+        </w:tc>
+        <w:tc>
+          <w:tcPr>
+            <w:tcW w:w="1930" w:type="dxa"/>
+          </w:tcPr>
+          <w:p>
+            <w:pPr>
+              <w:jc w:val="left"/>
+              <w:rPr>
+                <w:lang w:val="es-ES"/>
+              </w:rPr>
+            </w:pPr>
+          </w:p>
+        </w:tc>
+        <w:tc>
+          <w:tcPr>
+            <w:tcW w:w="1930" w:type="dxa"/>
+          </w:tcPr>
+          <w:p>
+            <w:pPr>
+              <w:rPr>
+                <w:lang w:val="es-ES"/>
+              </w:rPr>
+            </w:pPr>
+            <w:r>
+              <w:rPr>
+                <w:lang w:val="es-ES"/>
+              </w:rPr>
+              <w:t>Nombre: Israel</w:t>
+            </w:r>
+          </w:p>
+          <w:p>
+            <w:pPr>
+              <w:rPr>
+                <w:lang w:val="es-ES"/>
+              </w:rPr>
+            </w:pPr>
             <w:proofErr w:type="spellStart"/>
             <w:r>
               <w:rPr>
                 <w:lang w:val="es-ES"/>
               </w:rPr>
-              <w:t>Model</w:t>
+              <w:t>Pais</w:t>
             </w:r>
             <w:proofErr w:type="spellEnd"/>
             <w:r>
               <w:rPr>
                 <w:lang w:val="es-ES"/>
               </w:rPr>
-              <w:t xml:space="preserve"> S</w:t>
-            </w:r>
-          </w:p>
-          <w:p>
-            <w:pPr>
-              <w:rPr>
-                <w:lang w:val="es-ES"/>
-              </w:rPr>
-            </w:pPr>
-            <w:r>
-              <w:rPr>
-                <w:lang w:val="es-ES"/>
-              </w:rPr>
-              <w:t>Fabricante: Tesla</w:t>
-            </w:r>
-          </w:p>
-          <w:p>
-            <w:pPr>
-              <w:rPr>
-                <w:lang w:val="es-ES"/>
-              </w:rPr>
-            </w:pPr>
-            <w:r>
-              <w:rPr>
-                <w:lang w:val="es-ES"/>
-              </w:rPr>
-              <w:t>Combustible: Eléctrico</w:t>
-            </w:r>
-          </w:p>
-          <w:p>
-            <w:pPr>
-              <w:rPr>
-                <w:lang w:val="es-ES"/>
-              </w:rPr>
-            </w:pPr>
-            <w:r>
-              <w:rPr>
-                <w:lang w:val="es-ES"/>
-              </w:rPr>
-              <w:t>Color: Blanco</w:t>
-            </w:r>
-          </w:p>
-          <w:p>
-            <w:pPr>
-              <w:rPr>
-                <w:lang w:val="es-ES"/>
-              </w:rPr>
-            </w:pPr>
-            <w:r>
-              <w:rPr>
-                <w:lang w:val="es-ES"/>
-              </w:rPr>
-              <w:t>Modelo: R8</w:t>
-            </w:r>
-          </w:p>
-          <w:p>
-            <w:pPr>
-              <w:rPr>
-                <w:lang w:val="es-ES"/>
-              </w:rPr>
-            </w:pPr>
-            <w:r>
-              <w:rPr>
-                <w:lang w:val="es-ES"/>
-              </w:rPr>
-              <w:t>Fabricante: Audi</w:t>
-            </w:r>
-          </w:p>
-          <w:p>
-            <w:pPr>
-              <w:rPr>
-                <w:lang w:val="es-ES"/>
-              </w:rPr>
-            </w:pPr>
-            <w:r>
-              <w:rPr>
-                <w:lang w:val="es-ES"/>
-              </w:rPr>
-              <w:t>Combustible: Gasolina</w:t>
-            </w:r>
-          </w:p>
-          <w:p>
-            <w:pPr>
-              <w:rPr>
-                <w:lang w:val="es-ES"/>
-              </w:rPr>
-            </w:pPr>
-            <w:r>
-              <w:rPr>
-                <w:lang w:val="es-ES"/>
-              </w:rPr>
-              <w:t>Color: Rojo</w:t>
-            </w:r>
-          </w:p>
-          <w:p>
-            <w:pPr>
-              <w:jc w:val="left"/>
-              <w:rPr>
-                <w:lang w:val="es-ES"/>
-              </w:rPr>
-            </w:pPr>
-          </w:p>
-        </w:tc>
-        <w:tc>
-          <w:tcPr>
-            <w:tcW w:w="1930" w:type="dxa"/>
-          </w:tcPr>
-          <w:p>
-            <w:pPr>
-              <w:jc w:val="left"/>
-              <w:rPr>
-                <w:lang w:val="es-ES"/>
-              </w:rPr>
-            </w:pPr>
-          </w:p>
-        </w:tc>
-        <w:tc>
-          <w:tcPr>
-            <w:tcW w:w="1930" w:type="dxa"/>
-          </w:tcPr>
-          <w:p>
-            <w:pPr>
-              <w:rPr>
-                <w:lang w:val="es-ES"/>
-              </w:rPr>
-            </w:pPr>
-            <w:r>
-              <w:rPr>
-                <w:lang w:val="es-ES"/>
-              </w:rPr>
-              <w:t>Nombre: Israel</w:t>
-            </w:r>
-          </w:p>
-          <w:p>
-            <w:pPr>
-              <w:rPr>
-                <w:lang w:val="es-ES"/>
-              </w:rPr>
-            </w:pPr>
-            <w:proofErr w:type="spellStart"/>
-            <w:r>
-              <w:rPr>
-                <w:lang w:val="es-ES"/>
-              </w:rPr>
-              <w:t>Pais</w:t>
-            </w:r>
-            <w:proofErr w:type="spellEnd"/>
-            <w:r>
-              <w:rPr>
-                <w:lang w:val="es-ES"/>
-              </w:rPr>
               <w:t xml:space="preserve">: </w:t>
             </w:r>
-            <w:proofErr w:type="spellStart"/>
-            <w:r>
-              <w:rPr>
-                <w:lang w:val="es-ES"/>
-              </w:rPr>
-              <w:t>Spain</w:t>
-            </w:r>
-            <w:proofErr w:type="spellEnd"/>
-          </w:p>
-          <w:p>
-            <w:pPr>
-              <w:rPr>
-                <w:lang w:val="es-ES"/>
-              </w:rPr>
-            </w:pPr>
-            <w:r>
-              <w:rPr>
-                <w:lang w:val="es-ES"/>
-              </w:rPr>
-              <w:t xml:space="preserve">Tipo de Conductor: </w:t>
-            </w:r>
-            <w:r>
-              <w:rPr>
-                <w:lang w:val="es-ES"/>
-              </w:rPr>
-              <w:t>“”</w:t>
+            <w:r>
+              <w:rPr>
+                <w:lang w:val="es-ES"/>
+              </w:rPr>
+              <w:t>España</w:t>
+            </w:r>
+          </w:p>
+          <w:p>
+            <w:pPr>
+              <w:rPr>
+                <w:lang w:val="es-ES"/>
+              </w:rPr>
+            </w:pPr>
+            <w:r>
+              <w:rPr>
+                <w:lang w:val="es-ES"/>
+              </w:rPr>
+              <w:t>Tipo de Conductor: “”</w:t>
             </w:r>
           </w:p>
           <w:p>
@@ -4400,25 +4288,7 @@
               <w:rPr>
                 <w:lang w:val="es-ES"/>
               </w:rPr>
-              <w:t xml:space="preserve"> </w:t>
-            </w:r>
-            <w:r>
-              <w:rPr>
-                <w:lang w:val="es-ES"/>
-              </w:rPr>
-              <w:t>–</w:t>
-            </w:r>
-            <w:r>
-              <w:rPr>
-                <w:lang w:val="es-ES"/>
-              </w:rPr>
-              <w:t xml:space="preserve"> 5</w:t>
-            </w:r>
-            <w:r>
-              <w:rPr>
-                <w:lang w:val="es-ES"/>
-              </w:rPr>
-              <w:t xml:space="preserve"> / Rating </w:t>
+              <w:t xml:space="preserve"> – 5 / Rating </w:t>
             </w:r>
             <w:proofErr w:type="spellStart"/>
             <w:r>
@@ -4444,113 +4314,177 @@
               <w:rPr>
                 <w:lang w:val="es-ES"/>
               </w:rPr>
-              <w:t xml:space="preserve">Modelo: </w:t>
-            </w:r>
+              <w:t>Modelo: Model S</w:t>
+            </w:r>
+          </w:p>
+          <w:p>
+            <w:pPr>
+              <w:rPr>
+                <w:lang w:val="es-ES"/>
+              </w:rPr>
+            </w:pPr>
+            <w:r>
+              <w:rPr>
+                <w:lang w:val="es-ES"/>
+              </w:rPr>
+              <w:t>Fabricante: Tesla</w:t>
+            </w:r>
+          </w:p>
+          <w:p>
+            <w:pPr>
+              <w:rPr>
+                <w:lang w:val="es-ES"/>
+              </w:rPr>
+            </w:pPr>
+            <w:r>
+              <w:rPr>
+                <w:lang w:val="es-ES"/>
+              </w:rPr>
+              <w:t>Combustible: Eléctrico</w:t>
+            </w:r>
+          </w:p>
+          <w:p>
+            <w:pPr>
+              <w:rPr>
+                <w:lang w:val="es-ES"/>
+              </w:rPr>
+            </w:pPr>
+            <w:r>
+              <w:rPr>
+                <w:lang w:val="es-ES"/>
+              </w:rPr>
+              <w:t>Color: Blanco</w:t>
+            </w:r>
+          </w:p>
+          <w:p>
+            <w:pPr>
+              <w:rPr>
+                <w:lang w:val="es-ES"/>
+              </w:rPr>
+            </w:pPr>
+            <w:r>
+              <w:rPr>
+                <w:lang w:val="es-ES"/>
+              </w:rPr>
+              <w:t>Modelo: R8</w:t>
+            </w:r>
+          </w:p>
+          <w:p>
+            <w:pPr>
+              <w:rPr>
+                <w:lang w:val="es-ES"/>
+              </w:rPr>
+            </w:pPr>
+            <w:r>
+              <w:rPr>
+                <w:lang w:val="es-ES"/>
+              </w:rPr>
+              <w:t>Fabricante: Audi</w:t>
+            </w:r>
+          </w:p>
+          <w:p>
+            <w:pPr>
+              <w:rPr>
+                <w:lang w:val="es-ES"/>
+              </w:rPr>
+            </w:pPr>
+            <w:r>
+              <w:rPr>
+                <w:lang w:val="es-ES"/>
+              </w:rPr>
+              <w:t>Combustible: Gasolina</w:t>
+            </w:r>
+          </w:p>
+          <w:p>
+            <w:pPr>
+              <w:rPr>
+                <w:lang w:val="es-ES"/>
+              </w:rPr>
+            </w:pPr>
+            <w:r>
+              <w:rPr>
+                <w:lang w:val="es-ES"/>
+              </w:rPr>
+              <w:t>Color: Rojo</w:t>
+            </w:r>
+          </w:p>
+          <w:p>
+            <w:pPr>
+              <w:jc w:val="left"/>
+              <w:rPr>
+                <w:lang w:val="es-ES"/>
+              </w:rPr>
+            </w:pPr>
+          </w:p>
+        </w:tc>
+        <w:tc>
+          <w:tcPr>
+            <w:tcW w:w="1930" w:type="dxa"/>
+          </w:tcPr>
+          <w:p>
+            <w:pPr>
+              <w:jc w:val="left"/>
+              <w:rPr>
+                <w:lang w:val="es-ES"/>
+              </w:rPr>
+            </w:pPr>
+          </w:p>
+        </w:tc>
+        <w:tc>
+          <w:tcPr>
+            <w:tcW w:w="1930" w:type="dxa"/>
+          </w:tcPr>
+          <w:p>
+            <w:pPr>
+              <w:rPr>
+                <w:lang w:val="es-ES"/>
+              </w:rPr>
+            </w:pPr>
+            <w:r>
+              <w:rPr>
+                <w:lang w:val="es-ES"/>
+              </w:rPr>
+              <w:t>Nombre: Israel</w:t>
+            </w:r>
+          </w:p>
+          <w:p>
+            <w:pPr>
+              <w:rPr>
+                <w:lang w:val="es-ES"/>
+              </w:rPr>
+            </w:pPr>
             <w:proofErr w:type="spellStart"/>
             <w:r>
               <w:rPr>
                 <w:lang w:val="es-ES"/>
               </w:rPr>
-              <w:t>Model</w:t>
+              <w:t>Pais</w:t>
             </w:r>
             <w:proofErr w:type="spellEnd"/>
             <w:r>
               <w:rPr>
                 <w:lang w:val="es-ES"/>
               </w:rPr>
-              <w:t xml:space="preserve"> S</w:t>
-            </w:r>
-          </w:p>
-          <w:p>
-            <w:pPr>
-              <w:rPr>
-                <w:lang w:val="es-ES"/>
-              </w:rPr>
-            </w:pPr>
-            <w:r>
-              <w:rPr>
-                <w:lang w:val="es-ES"/>
-              </w:rPr>
-              <w:t>Fabricante: Tesla</w:t>
-            </w:r>
-          </w:p>
-          <w:p>
-            <w:pPr>
-              <w:rPr>
-                <w:lang w:val="es-ES"/>
-              </w:rPr>
-            </w:pPr>
-            <w:r>
-              <w:rPr>
-                <w:lang w:val="es-ES"/>
-              </w:rPr>
-              <w:t>Combustible: Eléctrico</w:t>
-            </w:r>
-          </w:p>
-          <w:p>
-            <w:pPr>
-              <w:rPr>
-                <w:lang w:val="es-ES"/>
-              </w:rPr>
-            </w:pPr>
-            <w:r>
-              <w:rPr>
-                <w:lang w:val="es-ES"/>
-              </w:rPr>
-              <w:t>Color: Blanco</w:t>
-            </w:r>
-          </w:p>
-          <w:p>
-            <w:pPr>
-              <w:rPr>
-                <w:lang w:val="es-ES"/>
-              </w:rPr>
-            </w:pPr>
-            <w:r>
-              <w:rPr>
-                <w:lang w:val="es-ES"/>
-              </w:rPr>
-              <w:lastRenderedPageBreak/>
-              <w:t>Modelo: R8</w:t>
-            </w:r>
-          </w:p>
-          <w:p>
-            <w:pPr>
-              <w:rPr>
-                <w:lang w:val="es-ES"/>
-              </w:rPr>
-            </w:pPr>
-            <w:r>
-              <w:rPr>
-                <w:lang w:val="es-ES"/>
-              </w:rPr>
-              <w:t>Fabricante: Audi</w:t>
-            </w:r>
-          </w:p>
-          <w:p>
-            <w:pPr>
-              <w:rPr>
-                <w:lang w:val="es-ES"/>
-              </w:rPr>
-            </w:pPr>
-            <w:r>
-              <w:rPr>
-                <w:lang w:val="es-ES"/>
-              </w:rPr>
-              <w:t>Combustible: Gasolina</w:t>
-            </w:r>
-          </w:p>
-          <w:p>
-            <w:pPr>
-              <w:rPr>
-                <w:lang w:val="es-ES"/>
-              </w:rPr>
-            </w:pPr>
-            <w:r>
-              <w:rPr>
-                <w:lang w:val="es-ES"/>
-              </w:rPr>
-              <w:t>Color: Rojo</w:t>
+              <w:t xml:space="preserve">: </w:t>
+            </w:r>
+            <w:r>
+              <w:rPr>
+                <w:lang w:val="es-ES"/>
+              </w:rPr>
+              <w:t>España</w:t>
+            </w:r>
+          </w:p>
+          <w:p>
+            <w:pPr>
+              <w:rPr>
+                <w:lang w:val="es-ES"/>
+              </w:rPr>
+            </w:pPr>
+            <w:r>
+              <w:rPr>
+                <w:lang w:val="es-ES"/>
+              </w:rPr>
+              <w:t>Tipo de Conductor: Experto</w:t>
             </w:r>
           </w:p>
           <w:p>
@@ -4560,102 +4494,26 @@
                 <w:lang w:val="es-ES"/>
               </w:rPr>
             </w:pPr>
-          </w:p>
-        </w:tc>
-        <w:tc>
-          <w:tcPr>
-            <w:tcW w:w="1930" w:type="dxa"/>
-          </w:tcPr>
-          <w:p>
-            <w:pPr>
-              <w:jc w:val="left"/>
-              <w:rPr>
-                <w:lang w:val="es-ES"/>
-              </w:rPr>
-            </w:pPr>
-          </w:p>
-        </w:tc>
-        <w:tc>
-          <w:tcPr>
-            <w:tcW w:w="1930" w:type="dxa"/>
-          </w:tcPr>
-          <w:p>
-            <w:pPr>
-              <w:rPr>
-                <w:lang w:val="es-ES"/>
-              </w:rPr>
-            </w:pPr>
-            <w:r>
-              <w:rPr>
-                <w:lang w:val="es-ES"/>
-              </w:rPr>
-              <w:t>Nombre: Israel</w:t>
-            </w:r>
-          </w:p>
-          <w:p>
-            <w:pPr>
-              <w:rPr>
-                <w:lang w:val="es-ES"/>
-              </w:rPr>
-            </w:pPr>
-            <w:proofErr w:type="spellStart"/>
-            <w:r>
-              <w:rPr>
-                <w:lang w:val="es-ES"/>
-              </w:rPr>
-              <w:t>Pais</w:t>
-            </w:r>
-            <w:proofErr w:type="spellEnd"/>
-            <w:r>
-              <w:rPr>
-                <w:lang w:val="es-ES"/>
-              </w:rPr>
-              <w:t xml:space="preserve">: </w:t>
-            </w:r>
-            <w:proofErr w:type="spellStart"/>
-            <w:r>
-              <w:rPr>
-                <w:lang w:val="es-ES"/>
-              </w:rPr>
-              <w:t>Spain</w:t>
-            </w:r>
-            <w:proofErr w:type="spellEnd"/>
-          </w:p>
-          <w:p>
-            <w:pPr>
-              <w:rPr>
-                <w:lang w:val="es-ES"/>
-              </w:rPr>
-            </w:pPr>
-            <w:r>
-              <w:rPr>
-                <w:lang w:val="es-ES"/>
-              </w:rPr>
-              <w:t>Tipo de Conductor: Experto</w:t>
-            </w:r>
-          </w:p>
-          <w:p>
-            <w:pPr>
-              <w:jc w:val="left"/>
-              <w:rPr>
-                <w:lang w:val="es-ES"/>
-              </w:rPr>
-            </w:pPr>
-            <w:r>
-              <w:rPr>
-                <w:lang w:val="es-ES"/>
-              </w:rPr>
-              <w:lastRenderedPageBreak/>
+            <w:r>
+              <w:rPr>
+                <w:lang w:val="es-ES"/>
+              </w:rPr>
               <w:t xml:space="preserve">Rating: </w:t>
             </w:r>
-            <w:proofErr w:type="spellStart"/>
-            <w:r>
-              <w:rPr>
-                <w:lang w:val="es-ES"/>
-              </w:rPr>
-              <w:t>null</w:t>
-            </w:r>
-            <w:proofErr w:type="spellEnd"/>
+            <w:proofErr w:type="gramStart"/>
+            <w:r>
+              <w:rPr>
+                <w:lang w:val="es-ES"/>
+              </w:rPr>
+              <w:t>“”/</w:t>
+            </w:r>
+            <w:proofErr w:type="gramEnd"/>
+            <w:r>
+              <w:rPr>
+                <w:lang w:val="es-ES"/>
+              </w:rPr>
+              <w:t>0</w:t>
+            </w:r>
           </w:p>
         </w:tc>
         <w:tc>
@@ -4678,7 +4536,6 @@
               <w:rPr>
                 <w:lang w:val="es-ES"/>
               </w:rPr>
-              <w:lastRenderedPageBreak/>
               <w:t>El sistema notifica del error</w:t>
             </w:r>
           </w:p>
@@ -4845,14 +4702,12 @@
               </w:rPr>
               <w:t xml:space="preserve">: </w:t>
             </w:r>
-            <w:proofErr w:type="spellStart"/>
-            <w:r>
-              <w:rPr>
-                <w:lang w:val="es-ES"/>
-              </w:rPr>
-              <w:t>Spain</w:t>
-            </w:r>
-            <w:proofErr w:type="spellEnd"/>
+            <w:r>
+              <w:rPr>
+                <w:lang w:val="es-ES"/>
+              </w:rPr>
+              <w:t>España</w:t>
+            </w:r>
           </w:p>
           <w:p>
             <w:pPr>
@@ -4927,6 +4782,7 @@
         <w:rPr>
           <w:lang w:val="es-ES"/>
         </w:rPr>
+        <w:lastRenderedPageBreak/>
         <w:t>Necesidades ambientales</w:t>
       </w:r>
       <w:bookmarkEnd w:id="4"/>

</xml_diff>